<commit_message>
Final week5 contents committing
</commit_message>
<xml_diff>
--- a/Edureka-Applied_ML-7_Mar_2026.docx
+++ b/Edureka-Applied_ML-7_Mar_2026.docx
@@ -3018,6 +3018,31 @@
     </w:p>
     <w:p>
       <w:pPr>
+        <w:spacing w:after="0"/>
+        <w:ind w:left="720"/>
+        <w:rPr>
+          <w:kern w:val="0"/>
+          <w14:ligatures w14:val="none"/>
+        </w:rPr>
+      </w:pPr>
+      <w:r>
+        <w:t xml:space="preserve">(Often implemented by sorting distances </w:t>
+      </w:r>
+      <w:proofErr w:type="gramStart"/>
+      <w:r>
+        <w:t>ascending, or</w:t>
+      </w:r>
+      <w:proofErr w:type="gramEnd"/>
+      <w:r>
+        <w:t xml:space="preserve"> using a faster “top</w:t>
+      </w:r>
+      <w:r>
+        <w:noBreakHyphen/>
+        <w:t>K” selection instead of a full sort.)</w:t>
+      </w:r>
+    </w:p>
+    <w:p>
+      <w:pPr>
         <w:numPr>
           <w:ilvl w:val="0"/>
           <w:numId w:val="35"/>
@@ -3841,13 +3866,895 @@
     </w:p>
     <w:p>
       <w:pPr>
-        <w:rPr>
+        <w:pStyle w:val="Heading1"/>
+        <w:rPr>
+          <w:rFonts w:eastAsia="Times New Roman"/>
+          <w:kern w:val="36"/>
+          <w14:ligatures w14:val="none"/>
+        </w:rPr>
+      </w:pPr>
+      <w:r>
+        <w:rPr>
+          <w:rFonts w:eastAsia="Times New Roman"/>
+        </w:rPr>
+        <w:t>9. Support Vector Machine (SVM)</w:t>
+      </w:r>
+    </w:p>
+    <w:p>
+      <w:pPr>
+        <w:pStyle w:val="Heading2"/>
+        <w:rPr>
+          <w:rFonts w:eastAsia="Times New Roman"/>
           <w:kern w:val="0"/>
           <w14:ligatures w14:val="none"/>
         </w:rPr>
       </w:pPr>
       <w:r>
-        <w:t> </w:t>
+        <w:rPr>
+          <w:rFonts w:eastAsia="Times New Roman"/>
+        </w:rPr>
+        <w:t>9.1 Definition</w:t>
+      </w:r>
+    </w:p>
+    <w:p>
+      <w:pPr>
+        <w:numPr>
+          <w:ilvl w:val="0"/>
+          <w:numId w:val="45"/>
+        </w:numPr>
+        <w:spacing w:after="0"/>
+        <w:rPr>
+          <w:rFonts w:eastAsia="Times New Roman"/>
+          <w:kern w:val="0"/>
+          <w14:ligatures w14:val="none"/>
+        </w:rPr>
+      </w:pPr>
+      <w:r>
+        <w:rPr>
+          <w:rFonts w:eastAsia="Times New Roman"/>
+        </w:rPr>
+        <w:t>Supervised learning algorithm for classification (and regression via SVR).</w:t>
+      </w:r>
+    </w:p>
+    <w:p>
+      <w:pPr>
+        <w:numPr>
+          <w:ilvl w:val="0"/>
+          <w:numId w:val="45"/>
+        </w:numPr>
+        <w:spacing w:after="0"/>
+        <w:rPr>
+          <w:rFonts w:eastAsia="Times New Roman"/>
+        </w:rPr>
+      </w:pPr>
+      <w:r>
+        <w:rPr>
+          <w:rFonts w:eastAsia="Times New Roman"/>
+        </w:rPr>
+        <w:t>Goal: find a decision boundary (hyperplane) that separates classes with the largest margin.</w:t>
+      </w:r>
+    </w:p>
+    <w:p>
+      <w:pPr>
+        <w:pStyle w:val="Heading2"/>
+        <w:rPr>
+          <w:rFonts w:eastAsia="Times New Roman"/>
+          <w:kern w:val="0"/>
+          <w14:ligatures w14:val="none"/>
+        </w:rPr>
+      </w:pPr>
+      <w:r>
+        <w:rPr>
+          <w:rFonts w:eastAsia="Times New Roman"/>
+        </w:rPr>
+        <w:t>9.2 Intuition (Separating Hyperplane)</w:t>
+      </w:r>
+    </w:p>
+    <w:p>
+      <w:pPr>
+        <w:numPr>
+          <w:ilvl w:val="0"/>
+          <w:numId w:val="46"/>
+        </w:numPr>
+        <w:spacing w:after="0"/>
+        <w:rPr>
+          <w:rFonts w:eastAsia="Times New Roman"/>
+          <w:kern w:val="0"/>
+          <w14:ligatures w14:val="none"/>
+        </w:rPr>
+      </w:pPr>
+      <w:r>
+        <w:rPr>
+          <w:rFonts w:eastAsia="Times New Roman"/>
+        </w:rPr>
+        <w:t>A hyperplane divides the feature space into classes.</w:t>
+      </w:r>
+    </w:p>
+    <w:p>
+      <w:pPr>
+        <w:numPr>
+          <w:ilvl w:val="0"/>
+          <w:numId w:val="46"/>
+        </w:numPr>
+        <w:spacing w:after="0"/>
+        <w:rPr>
+          <w:rFonts w:eastAsia="Times New Roman"/>
+        </w:rPr>
+      </w:pPr>
+      <w:r>
+        <w:rPr>
+          <w:rFonts w:eastAsia="Times New Roman"/>
+        </w:rPr>
+        <w:t xml:space="preserve">Only a few training points define the boundary: </w:t>
+      </w:r>
+      <w:r>
+        <w:rPr>
+          <w:rFonts w:eastAsia="Times New Roman"/>
+          <w:b/>
+          <w:bCs/>
+        </w:rPr>
+        <w:t>support vectors</w:t>
+      </w:r>
+      <w:r>
+        <w:rPr>
+          <w:rFonts w:eastAsia="Times New Roman"/>
+        </w:rPr>
+        <w:t>.</w:t>
+      </w:r>
+    </w:p>
+    <w:p>
+      <w:pPr>
+        <w:pStyle w:val="Heading2"/>
+        <w:rPr>
+          <w:rFonts w:eastAsia="Times New Roman"/>
+          <w:kern w:val="0"/>
+          <w14:ligatures w14:val="none"/>
+        </w:rPr>
+      </w:pPr>
+      <w:r>
+        <w:rPr>
+          <w:rFonts w:eastAsia="Times New Roman"/>
+        </w:rPr>
+        <w:t>9.3 Margin, Hard Margin vs Soft Margin</w:t>
+      </w:r>
+    </w:p>
+    <w:p>
+      <w:pPr>
+        <w:numPr>
+          <w:ilvl w:val="0"/>
+          <w:numId w:val="47"/>
+        </w:numPr>
+        <w:spacing w:after="0"/>
+        <w:rPr>
+          <w:rFonts w:eastAsia="Times New Roman"/>
+          <w:kern w:val="0"/>
+          <w14:ligatures w14:val="none"/>
+        </w:rPr>
+      </w:pPr>
+      <w:r>
+        <w:rPr>
+          <w:rFonts w:eastAsia="Times New Roman"/>
+        </w:rPr>
+        <w:t>Margin = distance between the hyperplane and the closest points from each class.</w:t>
+      </w:r>
+    </w:p>
+    <w:p>
+      <w:pPr>
+        <w:numPr>
+          <w:ilvl w:val="0"/>
+          <w:numId w:val="47"/>
+        </w:numPr>
+        <w:spacing w:after="0"/>
+        <w:rPr>
+          <w:rFonts w:eastAsia="Times New Roman"/>
+        </w:rPr>
+      </w:pPr>
+      <w:r>
+        <w:rPr>
+          <w:rFonts w:eastAsia="Times New Roman"/>
+        </w:rPr>
+        <w:t>Hard margin: no misclassifications allowed (rare in real data).</w:t>
+      </w:r>
+    </w:p>
+    <w:p>
+      <w:pPr>
+        <w:numPr>
+          <w:ilvl w:val="0"/>
+          <w:numId w:val="47"/>
+        </w:numPr>
+        <w:spacing w:after="0"/>
+        <w:rPr>
+          <w:rFonts w:eastAsia="Times New Roman"/>
+        </w:rPr>
+      </w:pPr>
+      <w:r>
+        <w:rPr>
+          <w:rFonts w:eastAsia="Times New Roman"/>
+        </w:rPr>
+        <w:t xml:space="preserve">Soft margin: allows some errors to improve generalization (controlled by </w:t>
+      </w:r>
+      <w:r>
+        <w:rPr>
+          <w:rFonts w:eastAsia="Times New Roman"/>
+          <w:i/>
+          <w:iCs/>
+        </w:rPr>
+        <w:t>C</w:t>
+      </w:r>
+      <w:r>
+        <w:rPr>
+          <w:rFonts w:eastAsia="Times New Roman"/>
+        </w:rPr>
+        <w:t>).</w:t>
+      </w:r>
+    </w:p>
+    <w:p>
+      <w:pPr>
+        <w:pStyle w:val="Heading2"/>
+        <w:rPr>
+          <w:rFonts w:eastAsia="Times New Roman"/>
+          <w:kern w:val="0"/>
+          <w14:ligatures w14:val="none"/>
+        </w:rPr>
+      </w:pPr>
+      <w:r>
+        <w:rPr>
+          <w:rFonts w:eastAsia="Times New Roman"/>
+        </w:rPr>
+        <w:t>9.4 Kernels (Non-linear SVM)</w:t>
+      </w:r>
+    </w:p>
+    <w:p>
+      <w:pPr>
+        <w:numPr>
+          <w:ilvl w:val="0"/>
+          <w:numId w:val="48"/>
+        </w:numPr>
+        <w:spacing w:after="0"/>
+        <w:rPr>
+          <w:rFonts w:eastAsia="Times New Roman"/>
+          <w:kern w:val="0"/>
+          <w14:ligatures w14:val="none"/>
+        </w:rPr>
+      </w:pPr>
+      <w:r>
+        <w:rPr>
+          <w:rFonts w:eastAsia="Times New Roman"/>
+        </w:rPr>
+        <w:t>Linear SVM: works when data is linearly separable (or close).</w:t>
+      </w:r>
+    </w:p>
+    <w:p>
+      <w:pPr>
+        <w:numPr>
+          <w:ilvl w:val="0"/>
+          <w:numId w:val="48"/>
+        </w:numPr>
+        <w:spacing w:after="0"/>
+        <w:rPr>
+          <w:rFonts w:eastAsia="Times New Roman"/>
+        </w:rPr>
+      </w:pPr>
+      <w:r>
+        <w:rPr>
+          <w:rFonts w:eastAsia="Times New Roman"/>
+        </w:rPr>
+        <w:lastRenderedPageBreak/>
+        <w:t>Kernel trick: implicitly maps data into a higher-dimensional space to allow non-linear boundaries.</w:t>
+      </w:r>
+    </w:p>
+    <w:p>
+      <w:pPr>
+        <w:numPr>
+          <w:ilvl w:val="0"/>
+          <w:numId w:val="48"/>
+        </w:numPr>
+        <w:spacing w:after="0"/>
+        <w:rPr>
+          <w:rFonts w:eastAsia="Times New Roman"/>
+        </w:rPr>
+      </w:pPr>
+      <w:r>
+        <w:rPr>
+          <w:rFonts w:eastAsia="Times New Roman"/>
+        </w:rPr>
+        <w:t>Common kernels: linear, polynomial, RBF (Gaussian), sigmoid.</w:t>
+      </w:r>
+    </w:p>
+    <w:p>
+      <w:pPr>
+        <w:pStyle w:val="Heading2"/>
+        <w:rPr>
+          <w:rFonts w:eastAsia="Times New Roman"/>
+          <w:kern w:val="0"/>
+          <w14:ligatures w14:val="none"/>
+        </w:rPr>
+      </w:pPr>
+      <w:r>
+        <w:rPr>
+          <w:rFonts w:eastAsia="Times New Roman"/>
+        </w:rPr>
+        <w:t>9.5 Key Hyperparameters</w:t>
+      </w:r>
+    </w:p>
+    <w:p>
+      <w:pPr>
+        <w:numPr>
+          <w:ilvl w:val="0"/>
+          <w:numId w:val="49"/>
+        </w:numPr>
+        <w:spacing w:after="0"/>
+        <w:rPr>
+          <w:rFonts w:eastAsia="Times New Roman"/>
+          <w:kern w:val="0"/>
+          <w14:ligatures w14:val="none"/>
+        </w:rPr>
+      </w:pPr>
+      <w:r>
+        <w:rPr>
+          <w:rFonts w:eastAsia="Times New Roman"/>
+          <w:i/>
+          <w:iCs/>
+        </w:rPr>
+        <w:t>C</w:t>
+      </w:r>
+      <w:r>
+        <w:rPr>
+          <w:rFonts w:eastAsia="Times New Roman"/>
+        </w:rPr>
+        <w:t>: regularization / penalty for misclassification (controls soft margin strength).</w:t>
+      </w:r>
+    </w:p>
+    <w:p>
+      <w:pPr>
+        <w:numPr>
+          <w:ilvl w:val="0"/>
+          <w:numId w:val="49"/>
+        </w:numPr>
+        <w:spacing w:after="0"/>
+        <w:rPr>
+          <w:rFonts w:eastAsia="Times New Roman"/>
+        </w:rPr>
+      </w:pPr>
+      <w:r>
+        <w:rPr>
+          <w:rFonts w:eastAsia="Times New Roman"/>
+          <w:i/>
+          <w:iCs/>
+        </w:rPr>
+        <w:t>kernel</w:t>
+      </w:r>
+      <w:r>
+        <w:rPr>
+          <w:rFonts w:eastAsia="Times New Roman"/>
+        </w:rPr>
+        <w:t xml:space="preserve">: linear / poly / </w:t>
+      </w:r>
+      <w:proofErr w:type="spellStart"/>
+      <w:r>
+        <w:rPr>
+          <w:rFonts w:eastAsia="Times New Roman"/>
+        </w:rPr>
+        <w:t>rbf</w:t>
+      </w:r>
+      <w:proofErr w:type="spellEnd"/>
+      <w:r>
+        <w:rPr>
+          <w:rFonts w:eastAsia="Times New Roman"/>
+        </w:rPr>
+        <w:t xml:space="preserve"> / sigmoid.</w:t>
+      </w:r>
+    </w:p>
+    <w:p>
+      <w:pPr>
+        <w:numPr>
+          <w:ilvl w:val="0"/>
+          <w:numId w:val="49"/>
+        </w:numPr>
+        <w:spacing w:after="0"/>
+        <w:rPr>
+          <w:rFonts w:eastAsia="Times New Roman"/>
+        </w:rPr>
+      </w:pPr>
+      <w:r>
+        <w:rPr>
+          <w:rFonts w:eastAsia="Times New Roman"/>
+          <w:i/>
+          <w:iCs/>
+        </w:rPr>
+        <w:t>gamma</w:t>
+      </w:r>
+      <w:r>
+        <w:rPr>
+          <w:rFonts w:eastAsia="Times New Roman"/>
+        </w:rPr>
+        <w:t>: influence radius for RBF/poly (higher = more complex boundary).</w:t>
+      </w:r>
+    </w:p>
+    <w:p>
+      <w:pPr>
+        <w:numPr>
+          <w:ilvl w:val="0"/>
+          <w:numId w:val="49"/>
+        </w:numPr>
+        <w:spacing w:after="0"/>
+        <w:rPr>
+          <w:rFonts w:eastAsia="Times New Roman"/>
+        </w:rPr>
+      </w:pPr>
+      <w:r>
+        <w:rPr>
+          <w:rFonts w:eastAsia="Times New Roman"/>
+          <w:i/>
+          <w:iCs/>
+        </w:rPr>
+        <w:t>degree</w:t>
+      </w:r>
+      <w:r>
+        <w:rPr>
+          <w:rFonts w:eastAsia="Times New Roman"/>
+        </w:rPr>
+        <w:t>: polynomial degree (only for poly kernel).</w:t>
+      </w:r>
+    </w:p>
+    <w:p>
+      <w:pPr>
+        <w:pStyle w:val="Heading2"/>
+        <w:rPr>
+          <w:rFonts w:eastAsia="Times New Roman"/>
+          <w:kern w:val="0"/>
+          <w14:ligatures w14:val="none"/>
+        </w:rPr>
+      </w:pPr>
+      <w:r>
+        <w:rPr>
+          <w:rFonts w:eastAsia="Times New Roman"/>
+        </w:rPr>
+        <w:t>9.6 Feature Scaling (Important)</w:t>
+      </w:r>
+    </w:p>
+    <w:p>
+      <w:pPr>
+        <w:numPr>
+          <w:ilvl w:val="0"/>
+          <w:numId w:val="50"/>
+        </w:numPr>
+        <w:spacing w:after="0"/>
+        <w:rPr>
+          <w:rFonts w:eastAsia="Times New Roman"/>
+          <w:kern w:val="0"/>
+          <w14:ligatures w14:val="none"/>
+        </w:rPr>
+      </w:pPr>
+      <w:r>
+        <w:rPr>
+          <w:rFonts w:eastAsia="Times New Roman"/>
+        </w:rPr>
+        <w:t>SVM is sensitive to feature scales, especially with RBF/poly kernels.</w:t>
+      </w:r>
+    </w:p>
+    <w:p>
+      <w:pPr>
+        <w:numPr>
+          <w:ilvl w:val="0"/>
+          <w:numId w:val="50"/>
+        </w:numPr>
+        <w:spacing w:after="0"/>
+        <w:rPr>
+          <w:rFonts w:eastAsia="Times New Roman"/>
+        </w:rPr>
+      </w:pPr>
+      <w:r>
+        <w:rPr>
+          <w:rFonts w:eastAsia="Times New Roman"/>
+        </w:rPr>
+        <w:t xml:space="preserve">Use </w:t>
+      </w:r>
+      <w:proofErr w:type="spellStart"/>
+      <w:r>
+        <w:rPr>
+          <w:rFonts w:eastAsia="Times New Roman"/>
+        </w:rPr>
+        <w:t>StandardScaler</w:t>
+      </w:r>
+      <w:proofErr w:type="spellEnd"/>
+      <w:r>
+        <w:rPr>
+          <w:rFonts w:eastAsia="Times New Roman"/>
+        </w:rPr>
+        <w:t xml:space="preserve"> (or similar) in a Pipeline to avoid leakage during CV.</w:t>
+      </w:r>
+    </w:p>
+    <w:p>
+      <w:pPr>
+        <w:pStyle w:val="Heading2"/>
+        <w:rPr>
+          <w:rFonts w:eastAsia="Times New Roman"/>
+          <w:kern w:val="0"/>
+          <w14:ligatures w14:val="none"/>
+        </w:rPr>
+      </w:pPr>
+      <w:r>
+        <w:rPr>
+          <w:rFonts w:eastAsia="Times New Roman"/>
+        </w:rPr>
+        <w:t>9.7 SVM for Classification vs Regression</w:t>
+      </w:r>
+    </w:p>
+    <w:p>
+      <w:pPr>
+        <w:numPr>
+          <w:ilvl w:val="0"/>
+          <w:numId w:val="51"/>
+        </w:numPr>
+        <w:spacing w:after="0"/>
+        <w:rPr>
+          <w:rFonts w:eastAsia="Times New Roman"/>
+          <w:kern w:val="0"/>
+          <w14:ligatures w14:val="none"/>
+        </w:rPr>
+      </w:pPr>
+      <w:r>
+        <w:rPr>
+          <w:rFonts w:eastAsia="Times New Roman"/>
+          <w:b/>
+          <w:bCs/>
+        </w:rPr>
+        <w:t>Classification:</w:t>
+      </w:r>
+      <w:r>
+        <w:rPr>
+          <w:rFonts w:eastAsia="Times New Roman"/>
+        </w:rPr>
+        <w:t xml:space="preserve"> SVC / </w:t>
+      </w:r>
+      <w:proofErr w:type="spellStart"/>
+      <w:r>
+        <w:rPr>
+          <w:rFonts w:eastAsia="Times New Roman"/>
+        </w:rPr>
+        <w:t>LinearSVC</w:t>
+      </w:r>
+      <w:proofErr w:type="spellEnd"/>
+      <w:r>
+        <w:rPr>
+          <w:rFonts w:eastAsia="Times New Roman"/>
+        </w:rPr>
+        <w:t xml:space="preserve"> (predict class labels; can output decision scores).</w:t>
+      </w:r>
+    </w:p>
+    <w:p>
+      <w:pPr>
+        <w:numPr>
+          <w:ilvl w:val="0"/>
+          <w:numId w:val="51"/>
+        </w:numPr>
+        <w:spacing w:after="0"/>
+        <w:rPr>
+          <w:rFonts w:eastAsia="Times New Roman"/>
+        </w:rPr>
+      </w:pPr>
+      <w:r>
+        <w:rPr>
+          <w:rFonts w:eastAsia="Times New Roman"/>
+          <w:b/>
+          <w:bCs/>
+        </w:rPr>
+        <w:t>Regression:</w:t>
+      </w:r>
+      <w:r>
+        <w:rPr>
+          <w:rFonts w:eastAsia="Times New Roman"/>
+        </w:rPr>
+        <w:t xml:space="preserve"> SVR (predict continuous values using an </w:t>
+      </w:r>
+      <w:r>
+        <w:rPr>
+          <w:rFonts w:eastAsia="Times New Roman"/>
+        </w:rPr>
+        <w:softHyphen/>
+        <w:t>epsilon-insensitive</w:t>
+      </w:r>
+      <w:r>
+        <w:rPr>
+          <w:rFonts w:eastAsia="Times New Roman"/>
+        </w:rPr>
+        <w:softHyphen/>
+        <w:t xml:space="preserve"> margin).</w:t>
+      </w:r>
+    </w:p>
+    <w:p>
+      <w:pPr>
+        <w:pStyle w:val="Heading2"/>
+        <w:rPr>
+          <w:rFonts w:eastAsia="Times New Roman"/>
+          <w:kern w:val="0"/>
+          <w14:ligatures w14:val="none"/>
+        </w:rPr>
+      </w:pPr>
+      <w:r>
+        <w:rPr>
+          <w:rFonts w:eastAsia="Times New Roman"/>
+        </w:rPr>
+        <w:t>9.8 Pros and Cons</w:t>
+      </w:r>
+    </w:p>
+    <w:p>
+      <w:pPr>
+        <w:numPr>
+          <w:ilvl w:val="0"/>
+          <w:numId w:val="52"/>
+        </w:numPr>
+        <w:spacing w:after="0"/>
+        <w:rPr>
+          <w:rFonts w:eastAsia="Times New Roman"/>
+          <w:kern w:val="0"/>
+          <w14:ligatures w14:val="none"/>
+        </w:rPr>
+      </w:pPr>
+      <w:r>
+        <w:rPr>
+          <w:rFonts w:eastAsia="Times New Roman"/>
+          <w:b/>
+          <w:bCs/>
+        </w:rPr>
+        <w:t>Pros:</w:t>
+      </w:r>
+      <w:r>
+        <w:rPr>
+          <w:rFonts w:eastAsia="Times New Roman"/>
+        </w:rPr>
+        <w:t xml:space="preserve"> Works well on medium-sized datasets; effective in high-dimensional spaces; flexible with kernels.</w:t>
+      </w:r>
+    </w:p>
+    <w:p>
+      <w:pPr>
+        <w:numPr>
+          <w:ilvl w:val="0"/>
+          <w:numId w:val="52"/>
+        </w:numPr>
+        <w:spacing w:after="0"/>
+        <w:rPr>
+          <w:rFonts w:eastAsia="Times New Roman"/>
+        </w:rPr>
+      </w:pPr>
+      <w:r>
+        <w:rPr>
+          <w:rFonts w:eastAsia="Times New Roman"/>
+          <w:b/>
+          <w:bCs/>
+        </w:rPr>
+        <w:t>Cons:</w:t>
+      </w:r>
+      <w:r>
+        <w:rPr>
+          <w:rFonts w:eastAsia="Times New Roman"/>
+        </w:rPr>
+        <w:t xml:space="preserve"> Can be slow on large datasets; sensitive to hyperparameters and scaling; less interpretable than trees.</w:t>
+      </w:r>
+    </w:p>
+    <w:p>
+      <w:pPr>
+        <w:pStyle w:val="Heading2"/>
+        <w:rPr>
+          <w:rFonts w:eastAsia="Times New Roman"/>
+          <w:kern w:val="0"/>
+          <w14:ligatures w14:val="none"/>
+        </w:rPr>
+      </w:pPr>
+      <w:r>
+        <w:rPr>
+          <w:rFonts w:eastAsia="Times New Roman"/>
+        </w:rPr>
+        <w:t>9.9 When to Use SVM (and When Not To)</w:t>
+      </w:r>
+    </w:p>
+    <w:p>
+      <w:pPr>
+        <w:numPr>
+          <w:ilvl w:val="0"/>
+          <w:numId w:val="53"/>
+        </w:numPr>
+        <w:spacing w:after="0"/>
+        <w:rPr>
+          <w:rFonts w:eastAsia="Times New Roman"/>
+          <w:kern w:val="0"/>
+          <w14:ligatures w14:val="none"/>
+        </w:rPr>
+      </w:pPr>
+      <w:r>
+        <w:rPr>
+          <w:rFonts w:eastAsia="Times New Roman"/>
+        </w:rPr>
+        <w:t>Good baseline for text/classification with many features; good margin-based classifier.</w:t>
+      </w:r>
+    </w:p>
+    <w:p>
+      <w:pPr>
+        <w:numPr>
+          <w:ilvl w:val="0"/>
+          <w:numId w:val="53"/>
+        </w:numPr>
+        <w:spacing w:after="0"/>
+        <w:rPr>
+          <w:rFonts w:eastAsia="Times New Roman"/>
+        </w:rPr>
+      </w:pPr>
+      <w:r>
+        <w:rPr>
+          <w:rFonts w:eastAsia="Times New Roman"/>
+        </w:rPr>
+        <w:t>Not ideal when you have millions of samples unless using linear approximations or specialized solvers.</w:t>
+      </w:r>
+    </w:p>
+    <w:p>
+      <w:pPr>
+        <w:pStyle w:val="Heading2"/>
+        <w:rPr>
+          <w:rFonts w:eastAsia="Times New Roman"/>
+          <w:kern w:val="0"/>
+          <w14:ligatures w14:val="none"/>
+        </w:rPr>
+      </w:pPr>
+      <w:r>
+        <w:rPr>
+          <w:rFonts w:eastAsia="Times New Roman"/>
+        </w:rPr>
+        <w:t>9.10 scikit-learn Notes (Outline)</w:t>
+      </w:r>
+    </w:p>
+    <w:p>
+      <w:pPr>
+        <w:numPr>
+          <w:ilvl w:val="0"/>
+          <w:numId w:val="54"/>
+        </w:numPr>
+        <w:spacing w:after="0"/>
+        <w:rPr>
+          <w:rFonts w:eastAsia="Times New Roman"/>
+          <w:kern w:val="0"/>
+          <w14:ligatures w14:val="none"/>
+        </w:rPr>
+      </w:pPr>
+      <w:r>
+        <w:rPr>
+          <w:rFonts w:eastAsia="Times New Roman"/>
+        </w:rPr>
+        <w:t xml:space="preserve">Estimators: SVC, </w:t>
+      </w:r>
+      <w:proofErr w:type="spellStart"/>
+      <w:r>
+        <w:rPr>
+          <w:rFonts w:eastAsia="Times New Roman"/>
+        </w:rPr>
+        <w:t>LinearSVC</w:t>
+      </w:r>
+      <w:proofErr w:type="spellEnd"/>
+      <w:r>
+        <w:rPr>
+          <w:rFonts w:eastAsia="Times New Roman"/>
+        </w:rPr>
+        <w:t>, SVR.</w:t>
+      </w:r>
+    </w:p>
+    <w:p>
+      <w:pPr>
+        <w:numPr>
+          <w:ilvl w:val="0"/>
+          <w:numId w:val="54"/>
+        </w:numPr>
+        <w:spacing w:after="0"/>
+        <w:rPr>
+          <w:rFonts w:eastAsia="Times New Roman"/>
+        </w:rPr>
+      </w:pPr>
+      <w:r>
+        <w:rPr>
+          <w:rFonts w:eastAsia="Times New Roman"/>
+        </w:rPr>
+        <w:t xml:space="preserve">Typical tuning: </w:t>
+      </w:r>
+      <w:r>
+        <w:rPr>
+          <w:rFonts w:eastAsia="Times New Roman"/>
+          <w:i/>
+          <w:iCs/>
+        </w:rPr>
+        <w:t>C</w:t>
+      </w:r>
+      <w:r>
+        <w:rPr>
+          <w:rFonts w:eastAsia="Times New Roman"/>
+        </w:rPr>
+        <w:t xml:space="preserve">, </w:t>
+      </w:r>
+      <w:r>
+        <w:rPr>
+          <w:rFonts w:eastAsia="Times New Roman"/>
+          <w:i/>
+          <w:iCs/>
+        </w:rPr>
+        <w:t>kernel</w:t>
+      </w:r>
+      <w:r>
+        <w:rPr>
+          <w:rFonts w:eastAsia="Times New Roman"/>
+        </w:rPr>
+        <w:t xml:space="preserve">, </w:t>
+      </w:r>
+      <w:r>
+        <w:rPr>
+          <w:rFonts w:eastAsia="Times New Roman"/>
+          <w:i/>
+          <w:iCs/>
+        </w:rPr>
+        <w:t>gamma</w:t>
+      </w:r>
+      <w:r>
+        <w:rPr>
+          <w:rFonts w:eastAsia="Times New Roman"/>
+        </w:rPr>
+        <w:t xml:space="preserve"> (and </w:t>
+      </w:r>
+      <w:r>
+        <w:rPr>
+          <w:rFonts w:eastAsia="Times New Roman"/>
+          <w:i/>
+          <w:iCs/>
+        </w:rPr>
+        <w:t>degree</w:t>
+      </w:r>
+      <w:r>
+        <w:rPr>
+          <w:rFonts w:eastAsia="Times New Roman"/>
+        </w:rPr>
+        <w:t xml:space="preserve"> for poly).</w:t>
+      </w:r>
+    </w:p>
+    <w:p>
+      <w:pPr>
+        <w:numPr>
+          <w:ilvl w:val="0"/>
+          <w:numId w:val="54"/>
+        </w:numPr>
+        <w:spacing w:after="0"/>
+        <w:rPr>
+          <w:rFonts w:eastAsia="Times New Roman"/>
+        </w:rPr>
+      </w:pPr>
+      <w:r>
+        <w:rPr>
+          <w:rFonts w:eastAsia="Times New Roman"/>
+        </w:rPr>
+        <w:t xml:space="preserve">Use </w:t>
+      </w:r>
+      <w:proofErr w:type="spellStart"/>
+      <w:r>
+        <w:rPr>
+          <w:rFonts w:eastAsia="Times New Roman"/>
+        </w:rPr>
+        <w:t>GridSearchCV</w:t>
+      </w:r>
+      <w:proofErr w:type="spellEnd"/>
+      <w:r>
+        <w:rPr>
+          <w:rFonts w:eastAsia="Times New Roman"/>
+        </w:rPr>
+        <w:t>/</w:t>
+      </w:r>
+      <w:proofErr w:type="spellStart"/>
+      <w:r>
+        <w:rPr>
+          <w:rFonts w:eastAsia="Times New Roman"/>
+        </w:rPr>
+        <w:t>RandomizedSearchCV</w:t>
+      </w:r>
+      <w:proofErr w:type="spellEnd"/>
+      <w:r>
+        <w:rPr>
+          <w:rFonts w:eastAsia="Times New Roman"/>
+        </w:rPr>
+        <w:t xml:space="preserve"> with a Pipeline that includes scaling.</w:t>
       </w:r>
     </w:p>
     <w:sectPr>
@@ -4012,6 +4919,155 @@
     </w:lvl>
   </w:abstractNum>
   <w:abstractNum w:abstractNumId="1" w15:restartNumberingAfterBreak="0">
+    <w:nsid w:val="06146190"/>
+    <w:multiLevelType w:val="multilevel"/>
+    <w:tmpl w:val="39CC95DE"/>
+    <w:lvl w:ilvl="0">
+      <w:start w:val="1"/>
+      <w:numFmt w:val="bullet"/>
+      <w:lvlText w:val=""/>
+      <w:lvlJc w:val="left"/>
+      <w:pPr>
+        <w:tabs>
+          <w:tab w:val="num" w:pos="720"/>
+        </w:tabs>
+        <w:ind w:left="720" w:hanging="360"/>
+      </w:pPr>
+      <w:rPr>
+        <w:rFonts w:ascii="Symbol" w:hAnsi="Symbol" w:hint="default"/>
+        <w:sz w:val="20"/>
+      </w:rPr>
+    </w:lvl>
+    <w:lvl w:ilvl="1" w:tentative="1">
+      <w:start w:val="1"/>
+      <w:numFmt w:val="bullet"/>
+      <w:lvlText w:val="o"/>
+      <w:lvlJc w:val="left"/>
+      <w:pPr>
+        <w:tabs>
+          <w:tab w:val="num" w:pos="1440"/>
+        </w:tabs>
+        <w:ind w:left="1440" w:hanging="360"/>
+      </w:pPr>
+      <w:rPr>
+        <w:rFonts w:ascii="Courier New" w:hAnsi="Courier New" w:hint="default"/>
+        <w:sz w:val="20"/>
+      </w:rPr>
+    </w:lvl>
+    <w:lvl w:ilvl="2" w:tentative="1">
+      <w:start w:val="1"/>
+      <w:numFmt w:val="bullet"/>
+      <w:lvlText w:val=""/>
+      <w:lvlJc w:val="left"/>
+      <w:pPr>
+        <w:tabs>
+          <w:tab w:val="num" w:pos="2160"/>
+        </w:tabs>
+        <w:ind w:left="2160" w:hanging="360"/>
+      </w:pPr>
+      <w:rPr>
+        <w:rFonts w:ascii="Wingdings" w:hAnsi="Wingdings" w:hint="default"/>
+        <w:sz w:val="20"/>
+      </w:rPr>
+    </w:lvl>
+    <w:lvl w:ilvl="3" w:tentative="1">
+      <w:start w:val="1"/>
+      <w:numFmt w:val="bullet"/>
+      <w:lvlText w:val=""/>
+      <w:lvlJc w:val="left"/>
+      <w:pPr>
+        <w:tabs>
+          <w:tab w:val="num" w:pos="2880"/>
+        </w:tabs>
+        <w:ind w:left="2880" w:hanging="360"/>
+      </w:pPr>
+      <w:rPr>
+        <w:rFonts w:ascii="Wingdings" w:hAnsi="Wingdings" w:hint="default"/>
+        <w:sz w:val="20"/>
+      </w:rPr>
+    </w:lvl>
+    <w:lvl w:ilvl="4" w:tentative="1">
+      <w:start w:val="1"/>
+      <w:numFmt w:val="bullet"/>
+      <w:lvlText w:val=""/>
+      <w:lvlJc w:val="left"/>
+      <w:pPr>
+        <w:tabs>
+          <w:tab w:val="num" w:pos="3600"/>
+        </w:tabs>
+        <w:ind w:left="3600" w:hanging="360"/>
+      </w:pPr>
+      <w:rPr>
+        <w:rFonts w:ascii="Wingdings" w:hAnsi="Wingdings" w:hint="default"/>
+        <w:sz w:val="20"/>
+      </w:rPr>
+    </w:lvl>
+    <w:lvl w:ilvl="5" w:tentative="1">
+      <w:start w:val="1"/>
+      <w:numFmt w:val="bullet"/>
+      <w:lvlText w:val=""/>
+      <w:lvlJc w:val="left"/>
+      <w:pPr>
+        <w:tabs>
+          <w:tab w:val="num" w:pos="4320"/>
+        </w:tabs>
+        <w:ind w:left="4320" w:hanging="360"/>
+      </w:pPr>
+      <w:rPr>
+        <w:rFonts w:ascii="Wingdings" w:hAnsi="Wingdings" w:hint="default"/>
+        <w:sz w:val="20"/>
+      </w:rPr>
+    </w:lvl>
+    <w:lvl w:ilvl="6" w:tentative="1">
+      <w:start w:val="1"/>
+      <w:numFmt w:val="bullet"/>
+      <w:lvlText w:val=""/>
+      <w:lvlJc w:val="left"/>
+      <w:pPr>
+        <w:tabs>
+          <w:tab w:val="num" w:pos="5040"/>
+        </w:tabs>
+        <w:ind w:left="5040" w:hanging="360"/>
+      </w:pPr>
+      <w:rPr>
+        <w:rFonts w:ascii="Wingdings" w:hAnsi="Wingdings" w:hint="default"/>
+        <w:sz w:val="20"/>
+      </w:rPr>
+    </w:lvl>
+    <w:lvl w:ilvl="7" w:tentative="1">
+      <w:start w:val="1"/>
+      <w:numFmt w:val="bullet"/>
+      <w:lvlText w:val=""/>
+      <w:lvlJc w:val="left"/>
+      <w:pPr>
+        <w:tabs>
+          <w:tab w:val="num" w:pos="5760"/>
+        </w:tabs>
+        <w:ind w:left="5760" w:hanging="360"/>
+      </w:pPr>
+      <w:rPr>
+        <w:rFonts w:ascii="Wingdings" w:hAnsi="Wingdings" w:hint="default"/>
+        <w:sz w:val="20"/>
+      </w:rPr>
+    </w:lvl>
+    <w:lvl w:ilvl="8" w:tentative="1">
+      <w:start w:val="1"/>
+      <w:numFmt w:val="bullet"/>
+      <w:lvlText w:val=""/>
+      <w:lvlJc w:val="left"/>
+      <w:pPr>
+        <w:tabs>
+          <w:tab w:val="num" w:pos="6480"/>
+        </w:tabs>
+        <w:ind w:left="6480" w:hanging="360"/>
+      </w:pPr>
+      <w:rPr>
+        <w:rFonts w:ascii="Wingdings" w:hAnsi="Wingdings" w:hint="default"/>
+        <w:sz w:val="20"/>
+      </w:rPr>
+    </w:lvl>
+  </w:abstractNum>
+  <w:abstractNum w:abstractNumId="2" w15:restartNumberingAfterBreak="0">
     <w:nsid w:val="064D768A"/>
     <w:multiLevelType w:val="multilevel"/>
     <w:tmpl w:val="D554A6A0"/>
@@ -4160,7 +5216,7 @@
       </w:rPr>
     </w:lvl>
   </w:abstractNum>
-  <w:abstractNum w:abstractNumId="2" w15:restartNumberingAfterBreak="0">
+  <w:abstractNum w:abstractNumId="3" w15:restartNumberingAfterBreak="0">
     <w:nsid w:val="07615252"/>
     <w:multiLevelType w:val="multilevel"/>
     <w:tmpl w:val="BB56442E"/>
@@ -4309,7 +5365,7 @@
       </w:rPr>
     </w:lvl>
   </w:abstractNum>
-  <w:abstractNum w:abstractNumId="3" w15:restartNumberingAfterBreak="0">
+  <w:abstractNum w:abstractNumId="4" w15:restartNumberingAfterBreak="0">
     <w:nsid w:val="0F486C23"/>
     <w:multiLevelType w:val="hybridMultilevel"/>
     <w:tmpl w:val="A26CB51A"/>
@@ -4422,7 +5478,156 @@
       </w:rPr>
     </w:lvl>
   </w:abstractNum>
-  <w:abstractNum w:abstractNumId="4" w15:restartNumberingAfterBreak="0">
+  <w:abstractNum w:abstractNumId="5" w15:restartNumberingAfterBreak="0">
+    <w:nsid w:val="0F613821"/>
+    <w:multiLevelType w:val="multilevel"/>
+    <w:tmpl w:val="0E841E14"/>
+    <w:lvl w:ilvl="0">
+      <w:start w:val="1"/>
+      <w:numFmt w:val="bullet"/>
+      <w:lvlText w:val=""/>
+      <w:lvlJc w:val="left"/>
+      <w:pPr>
+        <w:tabs>
+          <w:tab w:val="num" w:pos="720"/>
+        </w:tabs>
+        <w:ind w:left="720" w:hanging="360"/>
+      </w:pPr>
+      <w:rPr>
+        <w:rFonts w:ascii="Symbol" w:hAnsi="Symbol" w:hint="default"/>
+        <w:sz w:val="20"/>
+      </w:rPr>
+    </w:lvl>
+    <w:lvl w:ilvl="1" w:tentative="1">
+      <w:start w:val="1"/>
+      <w:numFmt w:val="bullet"/>
+      <w:lvlText w:val="o"/>
+      <w:lvlJc w:val="left"/>
+      <w:pPr>
+        <w:tabs>
+          <w:tab w:val="num" w:pos="1440"/>
+        </w:tabs>
+        <w:ind w:left="1440" w:hanging="360"/>
+      </w:pPr>
+      <w:rPr>
+        <w:rFonts w:ascii="Courier New" w:hAnsi="Courier New" w:hint="default"/>
+        <w:sz w:val="20"/>
+      </w:rPr>
+    </w:lvl>
+    <w:lvl w:ilvl="2" w:tentative="1">
+      <w:start w:val="1"/>
+      <w:numFmt w:val="bullet"/>
+      <w:lvlText w:val=""/>
+      <w:lvlJc w:val="left"/>
+      <w:pPr>
+        <w:tabs>
+          <w:tab w:val="num" w:pos="2160"/>
+        </w:tabs>
+        <w:ind w:left="2160" w:hanging="360"/>
+      </w:pPr>
+      <w:rPr>
+        <w:rFonts w:ascii="Wingdings" w:hAnsi="Wingdings" w:hint="default"/>
+        <w:sz w:val="20"/>
+      </w:rPr>
+    </w:lvl>
+    <w:lvl w:ilvl="3" w:tentative="1">
+      <w:start w:val="1"/>
+      <w:numFmt w:val="bullet"/>
+      <w:lvlText w:val=""/>
+      <w:lvlJc w:val="left"/>
+      <w:pPr>
+        <w:tabs>
+          <w:tab w:val="num" w:pos="2880"/>
+        </w:tabs>
+        <w:ind w:left="2880" w:hanging="360"/>
+      </w:pPr>
+      <w:rPr>
+        <w:rFonts w:ascii="Wingdings" w:hAnsi="Wingdings" w:hint="default"/>
+        <w:sz w:val="20"/>
+      </w:rPr>
+    </w:lvl>
+    <w:lvl w:ilvl="4" w:tentative="1">
+      <w:start w:val="1"/>
+      <w:numFmt w:val="bullet"/>
+      <w:lvlText w:val=""/>
+      <w:lvlJc w:val="left"/>
+      <w:pPr>
+        <w:tabs>
+          <w:tab w:val="num" w:pos="3600"/>
+        </w:tabs>
+        <w:ind w:left="3600" w:hanging="360"/>
+      </w:pPr>
+      <w:rPr>
+        <w:rFonts w:ascii="Wingdings" w:hAnsi="Wingdings" w:hint="default"/>
+        <w:sz w:val="20"/>
+      </w:rPr>
+    </w:lvl>
+    <w:lvl w:ilvl="5" w:tentative="1">
+      <w:start w:val="1"/>
+      <w:numFmt w:val="bullet"/>
+      <w:lvlText w:val=""/>
+      <w:lvlJc w:val="left"/>
+      <w:pPr>
+        <w:tabs>
+          <w:tab w:val="num" w:pos="4320"/>
+        </w:tabs>
+        <w:ind w:left="4320" w:hanging="360"/>
+      </w:pPr>
+      <w:rPr>
+        <w:rFonts w:ascii="Wingdings" w:hAnsi="Wingdings" w:hint="default"/>
+        <w:sz w:val="20"/>
+      </w:rPr>
+    </w:lvl>
+    <w:lvl w:ilvl="6" w:tentative="1">
+      <w:start w:val="1"/>
+      <w:numFmt w:val="bullet"/>
+      <w:lvlText w:val=""/>
+      <w:lvlJc w:val="left"/>
+      <w:pPr>
+        <w:tabs>
+          <w:tab w:val="num" w:pos="5040"/>
+        </w:tabs>
+        <w:ind w:left="5040" w:hanging="360"/>
+      </w:pPr>
+      <w:rPr>
+        <w:rFonts w:ascii="Wingdings" w:hAnsi="Wingdings" w:hint="default"/>
+        <w:sz w:val="20"/>
+      </w:rPr>
+    </w:lvl>
+    <w:lvl w:ilvl="7" w:tentative="1">
+      <w:start w:val="1"/>
+      <w:numFmt w:val="bullet"/>
+      <w:lvlText w:val=""/>
+      <w:lvlJc w:val="left"/>
+      <w:pPr>
+        <w:tabs>
+          <w:tab w:val="num" w:pos="5760"/>
+        </w:tabs>
+        <w:ind w:left="5760" w:hanging="360"/>
+      </w:pPr>
+      <w:rPr>
+        <w:rFonts w:ascii="Wingdings" w:hAnsi="Wingdings" w:hint="default"/>
+        <w:sz w:val="20"/>
+      </w:rPr>
+    </w:lvl>
+    <w:lvl w:ilvl="8" w:tentative="1">
+      <w:start w:val="1"/>
+      <w:numFmt w:val="bullet"/>
+      <w:lvlText w:val=""/>
+      <w:lvlJc w:val="left"/>
+      <w:pPr>
+        <w:tabs>
+          <w:tab w:val="num" w:pos="6480"/>
+        </w:tabs>
+        <w:ind w:left="6480" w:hanging="360"/>
+      </w:pPr>
+      <w:rPr>
+        <w:rFonts w:ascii="Wingdings" w:hAnsi="Wingdings" w:hint="default"/>
+        <w:sz w:val="20"/>
+      </w:rPr>
+    </w:lvl>
+  </w:abstractNum>
+  <w:abstractNum w:abstractNumId="6" w15:restartNumberingAfterBreak="0">
     <w:nsid w:val="10AF3F5B"/>
     <w:multiLevelType w:val="multilevel"/>
     <w:tmpl w:val="956613AA"/>
@@ -4571,7 +5776,7 @@
       </w:rPr>
     </w:lvl>
   </w:abstractNum>
-  <w:abstractNum w:abstractNumId="5" w15:restartNumberingAfterBreak="0">
+  <w:abstractNum w:abstractNumId="7" w15:restartNumberingAfterBreak="0">
     <w:nsid w:val="1433281A"/>
     <w:multiLevelType w:val="multilevel"/>
     <w:tmpl w:val="63A2D968"/>
@@ -4720,7 +5925,7 @@
       </w:rPr>
     </w:lvl>
   </w:abstractNum>
-  <w:abstractNum w:abstractNumId="6" w15:restartNumberingAfterBreak="0">
+  <w:abstractNum w:abstractNumId="8" w15:restartNumberingAfterBreak="0">
     <w:nsid w:val="16D946B3"/>
     <w:multiLevelType w:val="multilevel"/>
     <w:tmpl w:val="20A266CA"/>
@@ -4869,7 +6074,7 @@
       </w:rPr>
     </w:lvl>
   </w:abstractNum>
-  <w:abstractNum w:abstractNumId="7" w15:restartNumberingAfterBreak="0">
+  <w:abstractNum w:abstractNumId="9" w15:restartNumberingAfterBreak="0">
     <w:nsid w:val="16ED3865"/>
     <w:multiLevelType w:val="multilevel"/>
     <w:tmpl w:val="8F58CFE8"/>
@@ -5018,7 +6223,7 @@
       </w:rPr>
     </w:lvl>
   </w:abstractNum>
-  <w:abstractNum w:abstractNumId="8" w15:restartNumberingAfterBreak="0">
+  <w:abstractNum w:abstractNumId="10" w15:restartNumberingAfterBreak="0">
     <w:nsid w:val="19C67FA3"/>
     <w:multiLevelType w:val="multilevel"/>
     <w:tmpl w:val="DFC0565E"/>
@@ -5167,7 +6372,7 @@
       </w:rPr>
     </w:lvl>
   </w:abstractNum>
-  <w:abstractNum w:abstractNumId="9" w15:restartNumberingAfterBreak="0">
+  <w:abstractNum w:abstractNumId="11" w15:restartNumberingAfterBreak="0">
     <w:nsid w:val="1EA441DB"/>
     <w:multiLevelType w:val="multilevel"/>
     <w:tmpl w:val="5D285D96"/>
@@ -5316,7 +6521,156 @@
       </w:rPr>
     </w:lvl>
   </w:abstractNum>
-  <w:abstractNum w:abstractNumId="10" w15:restartNumberingAfterBreak="0">
+  <w:abstractNum w:abstractNumId="12" w15:restartNumberingAfterBreak="0">
+    <w:nsid w:val="1FFE0B73"/>
+    <w:multiLevelType w:val="multilevel"/>
+    <w:tmpl w:val="C6BEE87C"/>
+    <w:lvl w:ilvl="0">
+      <w:start w:val="1"/>
+      <w:numFmt w:val="bullet"/>
+      <w:lvlText w:val=""/>
+      <w:lvlJc w:val="left"/>
+      <w:pPr>
+        <w:tabs>
+          <w:tab w:val="num" w:pos="720"/>
+        </w:tabs>
+        <w:ind w:left="720" w:hanging="360"/>
+      </w:pPr>
+      <w:rPr>
+        <w:rFonts w:ascii="Symbol" w:hAnsi="Symbol" w:hint="default"/>
+        <w:sz w:val="20"/>
+      </w:rPr>
+    </w:lvl>
+    <w:lvl w:ilvl="1" w:tentative="1">
+      <w:start w:val="1"/>
+      <w:numFmt w:val="bullet"/>
+      <w:lvlText w:val="o"/>
+      <w:lvlJc w:val="left"/>
+      <w:pPr>
+        <w:tabs>
+          <w:tab w:val="num" w:pos="1440"/>
+        </w:tabs>
+        <w:ind w:left="1440" w:hanging="360"/>
+      </w:pPr>
+      <w:rPr>
+        <w:rFonts w:ascii="Courier New" w:hAnsi="Courier New" w:hint="default"/>
+        <w:sz w:val="20"/>
+      </w:rPr>
+    </w:lvl>
+    <w:lvl w:ilvl="2" w:tentative="1">
+      <w:start w:val="1"/>
+      <w:numFmt w:val="bullet"/>
+      <w:lvlText w:val=""/>
+      <w:lvlJc w:val="left"/>
+      <w:pPr>
+        <w:tabs>
+          <w:tab w:val="num" w:pos="2160"/>
+        </w:tabs>
+        <w:ind w:left="2160" w:hanging="360"/>
+      </w:pPr>
+      <w:rPr>
+        <w:rFonts w:ascii="Wingdings" w:hAnsi="Wingdings" w:hint="default"/>
+        <w:sz w:val="20"/>
+      </w:rPr>
+    </w:lvl>
+    <w:lvl w:ilvl="3" w:tentative="1">
+      <w:start w:val="1"/>
+      <w:numFmt w:val="bullet"/>
+      <w:lvlText w:val=""/>
+      <w:lvlJc w:val="left"/>
+      <w:pPr>
+        <w:tabs>
+          <w:tab w:val="num" w:pos="2880"/>
+        </w:tabs>
+        <w:ind w:left="2880" w:hanging="360"/>
+      </w:pPr>
+      <w:rPr>
+        <w:rFonts w:ascii="Wingdings" w:hAnsi="Wingdings" w:hint="default"/>
+        <w:sz w:val="20"/>
+      </w:rPr>
+    </w:lvl>
+    <w:lvl w:ilvl="4" w:tentative="1">
+      <w:start w:val="1"/>
+      <w:numFmt w:val="bullet"/>
+      <w:lvlText w:val=""/>
+      <w:lvlJc w:val="left"/>
+      <w:pPr>
+        <w:tabs>
+          <w:tab w:val="num" w:pos="3600"/>
+        </w:tabs>
+        <w:ind w:left="3600" w:hanging="360"/>
+      </w:pPr>
+      <w:rPr>
+        <w:rFonts w:ascii="Wingdings" w:hAnsi="Wingdings" w:hint="default"/>
+        <w:sz w:val="20"/>
+      </w:rPr>
+    </w:lvl>
+    <w:lvl w:ilvl="5" w:tentative="1">
+      <w:start w:val="1"/>
+      <w:numFmt w:val="bullet"/>
+      <w:lvlText w:val=""/>
+      <w:lvlJc w:val="left"/>
+      <w:pPr>
+        <w:tabs>
+          <w:tab w:val="num" w:pos="4320"/>
+        </w:tabs>
+        <w:ind w:left="4320" w:hanging="360"/>
+      </w:pPr>
+      <w:rPr>
+        <w:rFonts w:ascii="Wingdings" w:hAnsi="Wingdings" w:hint="default"/>
+        <w:sz w:val="20"/>
+      </w:rPr>
+    </w:lvl>
+    <w:lvl w:ilvl="6" w:tentative="1">
+      <w:start w:val="1"/>
+      <w:numFmt w:val="bullet"/>
+      <w:lvlText w:val=""/>
+      <w:lvlJc w:val="left"/>
+      <w:pPr>
+        <w:tabs>
+          <w:tab w:val="num" w:pos="5040"/>
+        </w:tabs>
+        <w:ind w:left="5040" w:hanging="360"/>
+      </w:pPr>
+      <w:rPr>
+        <w:rFonts w:ascii="Wingdings" w:hAnsi="Wingdings" w:hint="default"/>
+        <w:sz w:val="20"/>
+      </w:rPr>
+    </w:lvl>
+    <w:lvl w:ilvl="7" w:tentative="1">
+      <w:start w:val="1"/>
+      <w:numFmt w:val="bullet"/>
+      <w:lvlText w:val=""/>
+      <w:lvlJc w:val="left"/>
+      <w:pPr>
+        <w:tabs>
+          <w:tab w:val="num" w:pos="5760"/>
+        </w:tabs>
+        <w:ind w:left="5760" w:hanging="360"/>
+      </w:pPr>
+      <w:rPr>
+        <w:rFonts w:ascii="Wingdings" w:hAnsi="Wingdings" w:hint="default"/>
+        <w:sz w:val="20"/>
+      </w:rPr>
+    </w:lvl>
+    <w:lvl w:ilvl="8" w:tentative="1">
+      <w:start w:val="1"/>
+      <w:numFmt w:val="bullet"/>
+      <w:lvlText w:val=""/>
+      <w:lvlJc w:val="left"/>
+      <w:pPr>
+        <w:tabs>
+          <w:tab w:val="num" w:pos="6480"/>
+        </w:tabs>
+        <w:ind w:left="6480" w:hanging="360"/>
+      </w:pPr>
+      <w:rPr>
+        <w:rFonts w:ascii="Wingdings" w:hAnsi="Wingdings" w:hint="default"/>
+        <w:sz w:val="20"/>
+      </w:rPr>
+    </w:lvl>
+  </w:abstractNum>
+  <w:abstractNum w:abstractNumId="13" w15:restartNumberingAfterBreak="0">
     <w:nsid w:val="24835D02"/>
     <w:multiLevelType w:val="multilevel"/>
     <w:tmpl w:val="D1ECC0CE"/>
@@ -5465,7 +6819,7 @@
       </w:rPr>
     </w:lvl>
   </w:abstractNum>
-  <w:abstractNum w:abstractNumId="11" w15:restartNumberingAfterBreak="0">
+  <w:abstractNum w:abstractNumId="14" w15:restartNumberingAfterBreak="0">
     <w:nsid w:val="2568528F"/>
     <w:multiLevelType w:val="multilevel"/>
     <w:tmpl w:val="F4749E9E"/>
@@ -5614,7 +6968,7 @@
       </w:rPr>
     </w:lvl>
   </w:abstractNum>
-  <w:abstractNum w:abstractNumId="12" w15:restartNumberingAfterBreak="0">
+  <w:abstractNum w:abstractNumId="15" w15:restartNumberingAfterBreak="0">
     <w:nsid w:val="264B5719"/>
     <w:multiLevelType w:val="multilevel"/>
     <w:tmpl w:val="39862D74"/>
@@ -5763,7 +7117,156 @@
       </w:rPr>
     </w:lvl>
   </w:abstractNum>
-  <w:abstractNum w:abstractNumId="13" w15:restartNumberingAfterBreak="0">
+  <w:abstractNum w:abstractNumId="16" w15:restartNumberingAfterBreak="0">
+    <w:nsid w:val="2B3A0F34"/>
+    <w:multiLevelType w:val="multilevel"/>
+    <w:tmpl w:val="E8E07794"/>
+    <w:lvl w:ilvl="0">
+      <w:start w:val="1"/>
+      <w:numFmt w:val="bullet"/>
+      <w:lvlText w:val=""/>
+      <w:lvlJc w:val="left"/>
+      <w:pPr>
+        <w:tabs>
+          <w:tab w:val="num" w:pos="720"/>
+        </w:tabs>
+        <w:ind w:left="720" w:hanging="360"/>
+      </w:pPr>
+      <w:rPr>
+        <w:rFonts w:ascii="Symbol" w:hAnsi="Symbol" w:hint="default"/>
+        <w:sz w:val="20"/>
+      </w:rPr>
+    </w:lvl>
+    <w:lvl w:ilvl="1" w:tentative="1">
+      <w:start w:val="1"/>
+      <w:numFmt w:val="bullet"/>
+      <w:lvlText w:val="o"/>
+      <w:lvlJc w:val="left"/>
+      <w:pPr>
+        <w:tabs>
+          <w:tab w:val="num" w:pos="1440"/>
+        </w:tabs>
+        <w:ind w:left="1440" w:hanging="360"/>
+      </w:pPr>
+      <w:rPr>
+        <w:rFonts w:ascii="Courier New" w:hAnsi="Courier New" w:hint="default"/>
+        <w:sz w:val="20"/>
+      </w:rPr>
+    </w:lvl>
+    <w:lvl w:ilvl="2" w:tentative="1">
+      <w:start w:val="1"/>
+      <w:numFmt w:val="bullet"/>
+      <w:lvlText w:val=""/>
+      <w:lvlJc w:val="left"/>
+      <w:pPr>
+        <w:tabs>
+          <w:tab w:val="num" w:pos="2160"/>
+        </w:tabs>
+        <w:ind w:left="2160" w:hanging="360"/>
+      </w:pPr>
+      <w:rPr>
+        <w:rFonts w:ascii="Wingdings" w:hAnsi="Wingdings" w:hint="default"/>
+        <w:sz w:val="20"/>
+      </w:rPr>
+    </w:lvl>
+    <w:lvl w:ilvl="3" w:tentative="1">
+      <w:start w:val="1"/>
+      <w:numFmt w:val="bullet"/>
+      <w:lvlText w:val=""/>
+      <w:lvlJc w:val="left"/>
+      <w:pPr>
+        <w:tabs>
+          <w:tab w:val="num" w:pos="2880"/>
+        </w:tabs>
+        <w:ind w:left="2880" w:hanging="360"/>
+      </w:pPr>
+      <w:rPr>
+        <w:rFonts w:ascii="Wingdings" w:hAnsi="Wingdings" w:hint="default"/>
+        <w:sz w:val="20"/>
+      </w:rPr>
+    </w:lvl>
+    <w:lvl w:ilvl="4" w:tentative="1">
+      <w:start w:val="1"/>
+      <w:numFmt w:val="bullet"/>
+      <w:lvlText w:val=""/>
+      <w:lvlJc w:val="left"/>
+      <w:pPr>
+        <w:tabs>
+          <w:tab w:val="num" w:pos="3600"/>
+        </w:tabs>
+        <w:ind w:left="3600" w:hanging="360"/>
+      </w:pPr>
+      <w:rPr>
+        <w:rFonts w:ascii="Wingdings" w:hAnsi="Wingdings" w:hint="default"/>
+        <w:sz w:val="20"/>
+      </w:rPr>
+    </w:lvl>
+    <w:lvl w:ilvl="5" w:tentative="1">
+      <w:start w:val="1"/>
+      <w:numFmt w:val="bullet"/>
+      <w:lvlText w:val=""/>
+      <w:lvlJc w:val="left"/>
+      <w:pPr>
+        <w:tabs>
+          <w:tab w:val="num" w:pos="4320"/>
+        </w:tabs>
+        <w:ind w:left="4320" w:hanging="360"/>
+      </w:pPr>
+      <w:rPr>
+        <w:rFonts w:ascii="Wingdings" w:hAnsi="Wingdings" w:hint="default"/>
+        <w:sz w:val="20"/>
+      </w:rPr>
+    </w:lvl>
+    <w:lvl w:ilvl="6" w:tentative="1">
+      <w:start w:val="1"/>
+      <w:numFmt w:val="bullet"/>
+      <w:lvlText w:val=""/>
+      <w:lvlJc w:val="left"/>
+      <w:pPr>
+        <w:tabs>
+          <w:tab w:val="num" w:pos="5040"/>
+        </w:tabs>
+        <w:ind w:left="5040" w:hanging="360"/>
+      </w:pPr>
+      <w:rPr>
+        <w:rFonts w:ascii="Wingdings" w:hAnsi="Wingdings" w:hint="default"/>
+        <w:sz w:val="20"/>
+      </w:rPr>
+    </w:lvl>
+    <w:lvl w:ilvl="7" w:tentative="1">
+      <w:start w:val="1"/>
+      <w:numFmt w:val="bullet"/>
+      <w:lvlText w:val=""/>
+      <w:lvlJc w:val="left"/>
+      <w:pPr>
+        <w:tabs>
+          <w:tab w:val="num" w:pos="5760"/>
+        </w:tabs>
+        <w:ind w:left="5760" w:hanging="360"/>
+      </w:pPr>
+      <w:rPr>
+        <w:rFonts w:ascii="Wingdings" w:hAnsi="Wingdings" w:hint="default"/>
+        <w:sz w:val="20"/>
+      </w:rPr>
+    </w:lvl>
+    <w:lvl w:ilvl="8" w:tentative="1">
+      <w:start w:val="1"/>
+      <w:numFmt w:val="bullet"/>
+      <w:lvlText w:val=""/>
+      <w:lvlJc w:val="left"/>
+      <w:pPr>
+        <w:tabs>
+          <w:tab w:val="num" w:pos="6480"/>
+        </w:tabs>
+        <w:ind w:left="6480" w:hanging="360"/>
+      </w:pPr>
+      <w:rPr>
+        <w:rFonts w:ascii="Wingdings" w:hAnsi="Wingdings" w:hint="default"/>
+        <w:sz w:val="20"/>
+      </w:rPr>
+    </w:lvl>
+  </w:abstractNum>
+  <w:abstractNum w:abstractNumId="17" w15:restartNumberingAfterBreak="0">
     <w:nsid w:val="2C8B1147"/>
     <w:multiLevelType w:val="hybridMultilevel"/>
     <w:tmpl w:val="09F0B302"/>
@@ -5876,7 +7379,7 @@
       </w:rPr>
     </w:lvl>
   </w:abstractNum>
-  <w:abstractNum w:abstractNumId="14" w15:restartNumberingAfterBreak="0">
+  <w:abstractNum w:abstractNumId="18" w15:restartNumberingAfterBreak="0">
     <w:nsid w:val="2E731EF8"/>
     <w:multiLevelType w:val="multilevel"/>
     <w:tmpl w:val="90C680A8"/>
@@ -6025,7 +7528,7 @@
       </w:rPr>
     </w:lvl>
   </w:abstractNum>
-  <w:abstractNum w:abstractNumId="15" w15:restartNumberingAfterBreak="0">
+  <w:abstractNum w:abstractNumId="19" w15:restartNumberingAfterBreak="0">
     <w:nsid w:val="303937A2"/>
     <w:multiLevelType w:val="multilevel"/>
     <w:tmpl w:val="F0046432"/>
@@ -6174,7 +7677,7 @@
       </w:rPr>
     </w:lvl>
   </w:abstractNum>
-  <w:abstractNum w:abstractNumId="16" w15:restartNumberingAfterBreak="0">
+  <w:abstractNum w:abstractNumId="20" w15:restartNumberingAfterBreak="0">
     <w:nsid w:val="304804DF"/>
     <w:multiLevelType w:val="hybridMultilevel"/>
     <w:tmpl w:val="FDD8E13E"/>
@@ -6287,7 +7790,7 @@
       </w:rPr>
     </w:lvl>
   </w:abstractNum>
-  <w:abstractNum w:abstractNumId="17" w15:restartNumberingAfterBreak="0">
+  <w:abstractNum w:abstractNumId="21" w15:restartNumberingAfterBreak="0">
     <w:nsid w:val="366E5F4D"/>
     <w:multiLevelType w:val="multilevel"/>
     <w:tmpl w:val="B7304F44"/>
@@ -6436,7 +7939,7 @@
       </w:rPr>
     </w:lvl>
   </w:abstractNum>
-  <w:abstractNum w:abstractNumId="18" w15:restartNumberingAfterBreak="0">
+  <w:abstractNum w:abstractNumId="22" w15:restartNumberingAfterBreak="0">
     <w:nsid w:val="38392DFF"/>
     <w:multiLevelType w:val="multilevel"/>
     <w:tmpl w:val="7E4249B6"/>
@@ -6585,7 +8088,7 @@
       </w:rPr>
     </w:lvl>
   </w:abstractNum>
-  <w:abstractNum w:abstractNumId="19" w15:restartNumberingAfterBreak="0">
+  <w:abstractNum w:abstractNumId="23" w15:restartNumberingAfterBreak="0">
     <w:nsid w:val="39B765C1"/>
     <w:multiLevelType w:val="multilevel"/>
     <w:tmpl w:val="D054AB38"/>
@@ -6734,7 +8237,7 @@
       </w:rPr>
     </w:lvl>
   </w:abstractNum>
-  <w:abstractNum w:abstractNumId="20" w15:restartNumberingAfterBreak="0">
+  <w:abstractNum w:abstractNumId="24" w15:restartNumberingAfterBreak="0">
     <w:nsid w:val="3EEF05EA"/>
     <w:multiLevelType w:val="multilevel"/>
     <w:tmpl w:val="023290CC"/>
@@ -6883,7 +8386,7 @@
       </w:rPr>
     </w:lvl>
   </w:abstractNum>
-  <w:abstractNum w:abstractNumId="21" w15:restartNumberingAfterBreak="0">
+  <w:abstractNum w:abstractNumId="25" w15:restartNumberingAfterBreak="0">
     <w:nsid w:val="3FA97425"/>
     <w:multiLevelType w:val="multilevel"/>
     <w:tmpl w:val="FD08D8B4"/>
@@ -7032,7 +8535,7 @@
       </w:rPr>
     </w:lvl>
   </w:abstractNum>
-  <w:abstractNum w:abstractNumId="22" w15:restartNumberingAfterBreak="0">
+  <w:abstractNum w:abstractNumId="26" w15:restartNumberingAfterBreak="0">
     <w:nsid w:val="40FA077F"/>
     <w:multiLevelType w:val="multilevel"/>
     <w:tmpl w:val="A6521982"/>
@@ -7181,7 +8684,7 @@
       </w:rPr>
     </w:lvl>
   </w:abstractNum>
-  <w:abstractNum w:abstractNumId="23" w15:restartNumberingAfterBreak="0">
+  <w:abstractNum w:abstractNumId="27" w15:restartNumberingAfterBreak="0">
     <w:nsid w:val="446944E6"/>
     <w:multiLevelType w:val="multilevel"/>
     <w:tmpl w:val="F5D0CAC2"/>
@@ -7330,7 +8833,7 @@
       </w:rPr>
     </w:lvl>
   </w:abstractNum>
-  <w:abstractNum w:abstractNumId="24" w15:restartNumberingAfterBreak="0">
+  <w:abstractNum w:abstractNumId="28" w15:restartNumberingAfterBreak="0">
     <w:nsid w:val="457728BF"/>
     <w:multiLevelType w:val="hybridMultilevel"/>
     <w:tmpl w:val="C382D2FA"/>
@@ -7443,7 +8946,156 @@
       </w:rPr>
     </w:lvl>
   </w:abstractNum>
-  <w:abstractNum w:abstractNumId="25" w15:restartNumberingAfterBreak="0">
+  <w:abstractNum w:abstractNumId="29" w15:restartNumberingAfterBreak="0">
+    <w:nsid w:val="4A3E72ED"/>
+    <w:multiLevelType w:val="multilevel"/>
+    <w:tmpl w:val="6F10197E"/>
+    <w:lvl w:ilvl="0">
+      <w:start w:val="1"/>
+      <w:numFmt w:val="bullet"/>
+      <w:lvlText w:val=""/>
+      <w:lvlJc w:val="left"/>
+      <w:pPr>
+        <w:tabs>
+          <w:tab w:val="num" w:pos="720"/>
+        </w:tabs>
+        <w:ind w:left="720" w:hanging="360"/>
+      </w:pPr>
+      <w:rPr>
+        <w:rFonts w:ascii="Symbol" w:hAnsi="Symbol" w:hint="default"/>
+        <w:sz w:val="20"/>
+      </w:rPr>
+    </w:lvl>
+    <w:lvl w:ilvl="1" w:tentative="1">
+      <w:start w:val="1"/>
+      <w:numFmt w:val="bullet"/>
+      <w:lvlText w:val="o"/>
+      <w:lvlJc w:val="left"/>
+      <w:pPr>
+        <w:tabs>
+          <w:tab w:val="num" w:pos="1440"/>
+        </w:tabs>
+        <w:ind w:left="1440" w:hanging="360"/>
+      </w:pPr>
+      <w:rPr>
+        <w:rFonts w:ascii="Courier New" w:hAnsi="Courier New" w:hint="default"/>
+        <w:sz w:val="20"/>
+      </w:rPr>
+    </w:lvl>
+    <w:lvl w:ilvl="2" w:tentative="1">
+      <w:start w:val="1"/>
+      <w:numFmt w:val="bullet"/>
+      <w:lvlText w:val=""/>
+      <w:lvlJc w:val="left"/>
+      <w:pPr>
+        <w:tabs>
+          <w:tab w:val="num" w:pos="2160"/>
+        </w:tabs>
+        <w:ind w:left="2160" w:hanging="360"/>
+      </w:pPr>
+      <w:rPr>
+        <w:rFonts w:ascii="Wingdings" w:hAnsi="Wingdings" w:hint="default"/>
+        <w:sz w:val="20"/>
+      </w:rPr>
+    </w:lvl>
+    <w:lvl w:ilvl="3" w:tentative="1">
+      <w:start w:val="1"/>
+      <w:numFmt w:val="bullet"/>
+      <w:lvlText w:val=""/>
+      <w:lvlJc w:val="left"/>
+      <w:pPr>
+        <w:tabs>
+          <w:tab w:val="num" w:pos="2880"/>
+        </w:tabs>
+        <w:ind w:left="2880" w:hanging="360"/>
+      </w:pPr>
+      <w:rPr>
+        <w:rFonts w:ascii="Wingdings" w:hAnsi="Wingdings" w:hint="default"/>
+        <w:sz w:val="20"/>
+      </w:rPr>
+    </w:lvl>
+    <w:lvl w:ilvl="4" w:tentative="1">
+      <w:start w:val="1"/>
+      <w:numFmt w:val="bullet"/>
+      <w:lvlText w:val=""/>
+      <w:lvlJc w:val="left"/>
+      <w:pPr>
+        <w:tabs>
+          <w:tab w:val="num" w:pos="3600"/>
+        </w:tabs>
+        <w:ind w:left="3600" w:hanging="360"/>
+      </w:pPr>
+      <w:rPr>
+        <w:rFonts w:ascii="Wingdings" w:hAnsi="Wingdings" w:hint="default"/>
+        <w:sz w:val="20"/>
+      </w:rPr>
+    </w:lvl>
+    <w:lvl w:ilvl="5" w:tentative="1">
+      <w:start w:val="1"/>
+      <w:numFmt w:val="bullet"/>
+      <w:lvlText w:val=""/>
+      <w:lvlJc w:val="left"/>
+      <w:pPr>
+        <w:tabs>
+          <w:tab w:val="num" w:pos="4320"/>
+        </w:tabs>
+        <w:ind w:left="4320" w:hanging="360"/>
+      </w:pPr>
+      <w:rPr>
+        <w:rFonts w:ascii="Wingdings" w:hAnsi="Wingdings" w:hint="default"/>
+        <w:sz w:val="20"/>
+      </w:rPr>
+    </w:lvl>
+    <w:lvl w:ilvl="6" w:tentative="1">
+      <w:start w:val="1"/>
+      <w:numFmt w:val="bullet"/>
+      <w:lvlText w:val=""/>
+      <w:lvlJc w:val="left"/>
+      <w:pPr>
+        <w:tabs>
+          <w:tab w:val="num" w:pos="5040"/>
+        </w:tabs>
+        <w:ind w:left="5040" w:hanging="360"/>
+      </w:pPr>
+      <w:rPr>
+        <w:rFonts w:ascii="Wingdings" w:hAnsi="Wingdings" w:hint="default"/>
+        <w:sz w:val="20"/>
+      </w:rPr>
+    </w:lvl>
+    <w:lvl w:ilvl="7" w:tentative="1">
+      <w:start w:val="1"/>
+      <w:numFmt w:val="bullet"/>
+      <w:lvlText w:val=""/>
+      <w:lvlJc w:val="left"/>
+      <w:pPr>
+        <w:tabs>
+          <w:tab w:val="num" w:pos="5760"/>
+        </w:tabs>
+        <w:ind w:left="5760" w:hanging="360"/>
+      </w:pPr>
+      <w:rPr>
+        <w:rFonts w:ascii="Wingdings" w:hAnsi="Wingdings" w:hint="default"/>
+        <w:sz w:val="20"/>
+      </w:rPr>
+    </w:lvl>
+    <w:lvl w:ilvl="8" w:tentative="1">
+      <w:start w:val="1"/>
+      <w:numFmt w:val="bullet"/>
+      <w:lvlText w:val=""/>
+      <w:lvlJc w:val="left"/>
+      <w:pPr>
+        <w:tabs>
+          <w:tab w:val="num" w:pos="6480"/>
+        </w:tabs>
+        <w:ind w:left="6480" w:hanging="360"/>
+      </w:pPr>
+      <w:rPr>
+        <w:rFonts w:ascii="Wingdings" w:hAnsi="Wingdings" w:hint="default"/>
+        <w:sz w:val="20"/>
+      </w:rPr>
+    </w:lvl>
+  </w:abstractNum>
+  <w:abstractNum w:abstractNumId="30" w15:restartNumberingAfterBreak="0">
     <w:nsid w:val="4AE62785"/>
     <w:multiLevelType w:val="multilevel"/>
     <w:tmpl w:val="88FEF296"/>
@@ -7592,7 +9244,7 @@
       </w:rPr>
     </w:lvl>
   </w:abstractNum>
-  <w:abstractNum w:abstractNumId="26" w15:restartNumberingAfterBreak="0">
+  <w:abstractNum w:abstractNumId="31" w15:restartNumberingAfterBreak="0">
     <w:nsid w:val="52BA63C5"/>
     <w:multiLevelType w:val="multilevel"/>
     <w:tmpl w:val="7CF091C0"/>
@@ -7741,7 +9393,156 @@
       </w:rPr>
     </w:lvl>
   </w:abstractNum>
-  <w:abstractNum w:abstractNumId="27" w15:restartNumberingAfterBreak="0">
+  <w:abstractNum w:abstractNumId="32" w15:restartNumberingAfterBreak="0">
+    <w:nsid w:val="53522F7A"/>
+    <w:multiLevelType w:val="multilevel"/>
+    <w:tmpl w:val="44F61408"/>
+    <w:lvl w:ilvl="0">
+      <w:start w:val="1"/>
+      <w:numFmt w:val="bullet"/>
+      <w:lvlText w:val=""/>
+      <w:lvlJc w:val="left"/>
+      <w:pPr>
+        <w:tabs>
+          <w:tab w:val="num" w:pos="720"/>
+        </w:tabs>
+        <w:ind w:left="720" w:hanging="360"/>
+      </w:pPr>
+      <w:rPr>
+        <w:rFonts w:ascii="Symbol" w:hAnsi="Symbol" w:hint="default"/>
+        <w:sz w:val="20"/>
+      </w:rPr>
+    </w:lvl>
+    <w:lvl w:ilvl="1" w:tentative="1">
+      <w:start w:val="1"/>
+      <w:numFmt w:val="bullet"/>
+      <w:lvlText w:val="o"/>
+      <w:lvlJc w:val="left"/>
+      <w:pPr>
+        <w:tabs>
+          <w:tab w:val="num" w:pos="1440"/>
+        </w:tabs>
+        <w:ind w:left="1440" w:hanging="360"/>
+      </w:pPr>
+      <w:rPr>
+        <w:rFonts w:ascii="Courier New" w:hAnsi="Courier New" w:hint="default"/>
+        <w:sz w:val="20"/>
+      </w:rPr>
+    </w:lvl>
+    <w:lvl w:ilvl="2" w:tentative="1">
+      <w:start w:val="1"/>
+      <w:numFmt w:val="bullet"/>
+      <w:lvlText w:val=""/>
+      <w:lvlJc w:val="left"/>
+      <w:pPr>
+        <w:tabs>
+          <w:tab w:val="num" w:pos="2160"/>
+        </w:tabs>
+        <w:ind w:left="2160" w:hanging="360"/>
+      </w:pPr>
+      <w:rPr>
+        <w:rFonts w:ascii="Wingdings" w:hAnsi="Wingdings" w:hint="default"/>
+        <w:sz w:val="20"/>
+      </w:rPr>
+    </w:lvl>
+    <w:lvl w:ilvl="3" w:tentative="1">
+      <w:start w:val="1"/>
+      <w:numFmt w:val="bullet"/>
+      <w:lvlText w:val=""/>
+      <w:lvlJc w:val="left"/>
+      <w:pPr>
+        <w:tabs>
+          <w:tab w:val="num" w:pos="2880"/>
+        </w:tabs>
+        <w:ind w:left="2880" w:hanging="360"/>
+      </w:pPr>
+      <w:rPr>
+        <w:rFonts w:ascii="Wingdings" w:hAnsi="Wingdings" w:hint="default"/>
+        <w:sz w:val="20"/>
+      </w:rPr>
+    </w:lvl>
+    <w:lvl w:ilvl="4" w:tentative="1">
+      <w:start w:val="1"/>
+      <w:numFmt w:val="bullet"/>
+      <w:lvlText w:val=""/>
+      <w:lvlJc w:val="left"/>
+      <w:pPr>
+        <w:tabs>
+          <w:tab w:val="num" w:pos="3600"/>
+        </w:tabs>
+        <w:ind w:left="3600" w:hanging="360"/>
+      </w:pPr>
+      <w:rPr>
+        <w:rFonts w:ascii="Wingdings" w:hAnsi="Wingdings" w:hint="default"/>
+        <w:sz w:val="20"/>
+      </w:rPr>
+    </w:lvl>
+    <w:lvl w:ilvl="5" w:tentative="1">
+      <w:start w:val="1"/>
+      <w:numFmt w:val="bullet"/>
+      <w:lvlText w:val=""/>
+      <w:lvlJc w:val="left"/>
+      <w:pPr>
+        <w:tabs>
+          <w:tab w:val="num" w:pos="4320"/>
+        </w:tabs>
+        <w:ind w:left="4320" w:hanging="360"/>
+      </w:pPr>
+      <w:rPr>
+        <w:rFonts w:ascii="Wingdings" w:hAnsi="Wingdings" w:hint="default"/>
+        <w:sz w:val="20"/>
+      </w:rPr>
+    </w:lvl>
+    <w:lvl w:ilvl="6" w:tentative="1">
+      <w:start w:val="1"/>
+      <w:numFmt w:val="bullet"/>
+      <w:lvlText w:val=""/>
+      <w:lvlJc w:val="left"/>
+      <w:pPr>
+        <w:tabs>
+          <w:tab w:val="num" w:pos="5040"/>
+        </w:tabs>
+        <w:ind w:left="5040" w:hanging="360"/>
+      </w:pPr>
+      <w:rPr>
+        <w:rFonts w:ascii="Wingdings" w:hAnsi="Wingdings" w:hint="default"/>
+        <w:sz w:val="20"/>
+      </w:rPr>
+    </w:lvl>
+    <w:lvl w:ilvl="7" w:tentative="1">
+      <w:start w:val="1"/>
+      <w:numFmt w:val="bullet"/>
+      <w:lvlText w:val=""/>
+      <w:lvlJc w:val="left"/>
+      <w:pPr>
+        <w:tabs>
+          <w:tab w:val="num" w:pos="5760"/>
+        </w:tabs>
+        <w:ind w:left="5760" w:hanging="360"/>
+      </w:pPr>
+      <w:rPr>
+        <w:rFonts w:ascii="Wingdings" w:hAnsi="Wingdings" w:hint="default"/>
+        <w:sz w:val="20"/>
+      </w:rPr>
+    </w:lvl>
+    <w:lvl w:ilvl="8" w:tentative="1">
+      <w:start w:val="1"/>
+      <w:numFmt w:val="bullet"/>
+      <w:lvlText w:val=""/>
+      <w:lvlJc w:val="left"/>
+      <w:pPr>
+        <w:tabs>
+          <w:tab w:val="num" w:pos="6480"/>
+        </w:tabs>
+        <w:ind w:left="6480" w:hanging="360"/>
+      </w:pPr>
+      <w:rPr>
+        <w:rFonts w:ascii="Wingdings" w:hAnsi="Wingdings" w:hint="default"/>
+        <w:sz w:val="20"/>
+      </w:rPr>
+    </w:lvl>
+  </w:abstractNum>
+  <w:abstractNum w:abstractNumId="33" w15:restartNumberingAfterBreak="0">
     <w:nsid w:val="53D1474E"/>
     <w:multiLevelType w:val="multilevel"/>
     <w:tmpl w:val="7B42FA76"/>
@@ -7890,7 +9691,7 @@
       </w:rPr>
     </w:lvl>
   </w:abstractNum>
-  <w:abstractNum w:abstractNumId="28" w15:restartNumberingAfterBreak="0">
+  <w:abstractNum w:abstractNumId="34" w15:restartNumberingAfterBreak="0">
     <w:nsid w:val="5A7C2065"/>
     <w:multiLevelType w:val="multilevel"/>
     <w:tmpl w:val="19C88C1E"/>
@@ -8039,7 +9840,7 @@
       </w:rPr>
     </w:lvl>
   </w:abstractNum>
-  <w:abstractNum w:abstractNumId="29" w15:restartNumberingAfterBreak="0">
+  <w:abstractNum w:abstractNumId="35" w15:restartNumberingAfterBreak="0">
     <w:nsid w:val="5B016D04"/>
     <w:multiLevelType w:val="multilevel"/>
     <w:tmpl w:val="ECB8D47E"/>
@@ -8152,7 +9953,7 @@
       </w:pPr>
     </w:lvl>
   </w:abstractNum>
-  <w:abstractNum w:abstractNumId="30" w15:restartNumberingAfterBreak="0">
+  <w:abstractNum w:abstractNumId="36" w15:restartNumberingAfterBreak="0">
     <w:nsid w:val="5DC21FF3"/>
     <w:multiLevelType w:val="multilevel"/>
     <w:tmpl w:val="CC5A208C"/>
@@ -8301,7 +10102,7 @@
       </w:rPr>
     </w:lvl>
   </w:abstractNum>
-  <w:abstractNum w:abstractNumId="31" w15:restartNumberingAfterBreak="0">
+  <w:abstractNum w:abstractNumId="37" w15:restartNumberingAfterBreak="0">
     <w:nsid w:val="5DDF6BA2"/>
     <w:multiLevelType w:val="multilevel"/>
     <w:tmpl w:val="F57C456A"/>
@@ -8450,7 +10251,7 @@
       </w:rPr>
     </w:lvl>
   </w:abstractNum>
-  <w:abstractNum w:abstractNumId="32" w15:restartNumberingAfterBreak="0">
+  <w:abstractNum w:abstractNumId="38" w15:restartNumberingAfterBreak="0">
     <w:nsid w:val="5E192451"/>
     <w:multiLevelType w:val="multilevel"/>
     <w:tmpl w:val="D90EA462"/>
@@ -8599,7 +10400,7 @@
       </w:rPr>
     </w:lvl>
   </w:abstractNum>
-  <w:abstractNum w:abstractNumId="33" w15:restartNumberingAfterBreak="0">
+  <w:abstractNum w:abstractNumId="39" w15:restartNumberingAfterBreak="0">
     <w:nsid w:val="5EE36949"/>
     <w:multiLevelType w:val="multilevel"/>
     <w:tmpl w:val="BB08C386"/>
@@ -8748,7 +10549,7 @@
       </w:rPr>
     </w:lvl>
   </w:abstractNum>
-  <w:abstractNum w:abstractNumId="34" w15:restartNumberingAfterBreak="0">
+  <w:abstractNum w:abstractNumId="40" w15:restartNumberingAfterBreak="0">
     <w:nsid w:val="60376C16"/>
     <w:multiLevelType w:val="multilevel"/>
     <w:tmpl w:val="BE0094D2"/>
@@ -8897,7 +10698,7 @@
       </w:rPr>
     </w:lvl>
   </w:abstractNum>
-  <w:abstractNum w:abstractNumId="35" w15:restartNumberingAfterBreak="0">
+  <w:abstractNum w:abstractNumId="41" w15:restartNumberingAfterBreak="0">
     <w:nsid w:val="6232631B"/>
     <w:multiLevelType w:val="multilevel"/>
     <w:tmpl w:val="8CB43F88"/>
@@ -9046,7 +10847,7 @@
       </w:rPr>
     </w:lvl>
   </w:abstractNum>
-  <w:abstractNum w:abstractNumId="36" w15:restartNumberingAfterBreak="0">
+  <w:abstractNum w:abstractNumId="42" w15:restartNumberingAfterBreak="0">
     <w:nsid w:val="639101C0"/>
     <w:multiLevelType w:val="multilevel"/>
     <w:tmpl w:val="7D4432C4"/>
@@ -9195,7 +10996,156 @@
       </w:rPr>
     </w:lvl>
   </w:abstractNum>
-  <w:abstractNum w:abstractNumId="37" w15:restartNumberingAfterBreak="0">
+  <w:abstractNum w:abstractNumId="43" w15:restartNumberingAfterBreak="0">
+    <w:nsid w:val="63947288"/>
+    <w:multiLevelType w:val="multilevel"/>
+    <w:tmpl w:val="19C4D37C"/>
+    <w:lvl w:ilvl="0">
+      <w:start w:val="1"/>
+      <w:numFmt w:val="bullet"/>
+      <w:lvlText w:val=""/>
+      <w:lvlJc w:val="left"/>
+      <w:pPr>
+        <w:tabs>
+          <w:tab w:val="num" w:pos="720"/>
+        </w:tabs>
+        <w:ind w:left="720" w:hanging="360"/>
+      </w:pPr>
+      <w:rPr>
+        <w:rFonts w:ascii="Symbol" w:hAnsi="Symbol" w:hint="default"/>
+        <w:sz w:val="20"/>
+      </w:rPr>
+    </w:lvl>
+    <w:lvl w:ilvl="1" w:tentative="1">
+      <w:start w:val="1"/>
+      <w:numFmt w:val="bullet"/>
+      <w:lvlText w:val="o"/>
+      <w:lvlJc w:val="left"/>
+      <w:pPr>
+        <w:tabs>
+          <w:tab w:val="num" w:pos="1440"/>
+        </w:tabs>
+        <w:ind w:left="1440" w:hanging="360"/>
+      </w:pPr>
+      <w:rPr>
+        <w:rFonts w:ascii="Courier New" w:hAnsi="Courier New" w:hint="default"/>
+        <w:sz w:val="20"/>
+      </w:rPr>
+    </w:lvl>
+    <w:lvl w:ilvl="2" w:tentative="1">
+      <w:start w:val="1"/>
+      <w:numFmt w:val="bullet"/>
+      <w:lvlText w:val=""/>
+      <w:lvlJc w:val="left"/>
+      <w:pPr>
+        <w:tabs>
+          <w:tab w:val="num" w:pos="2160"/>
+        </w:tabs>
+        <w:ind w:left="2160" w:hanging="360"/>
+      </w:pPr>
+      <w:rPr>
+        <w:rFonts w:ascii="Wingdings" w:hAnsi="Wingdings" w:hint="default"/>
+        <w:sz w:val="20"/>
+      </w:rPr>
+    </w:lvl>
+    <w:lvl w:ilvl="3" w:tentative="1">
+      <w:start w:val="1"/>
+      <w:numFmt w:val="bullet"/>
+      <w:lvlText w:val=""/>
+      <w:lvlJc w:val="left"/>
+      <w:pPr>
+        <w:tabs>
+          <w:tab w:val="num" w:pos="2880"/>
+        </w:tabs>
+        <w:ind w:left="2880" w:hanging="360"/>
+      </w:pPr>
+      <w:rPr>
+        <w:rFonts w:ascii="Wingdings" w:hAnsi="Wingdings" w:hint="default"/>
+        <w:sz w:val="20"/>
+      </w:rPr>
+    </w:lvl>
+    <w:lvl w:ilvl="4" w:tentative="1">
+      <w:start w:val="1"/>
+      <w:numFmt w:val="bullet"/>
+      <w:lvlText w:val=""/>
+      <w:lvlJc w:val="left"/>
+      <w:pPr>
+        <w:tabs>
+          <w:tab w:val="num" w:pos="3600"/>
+        </w:tabs>
+        <w:ind w:left="3600" w:hanging="360"/>
+      </w:pPr>
+      <w:rPr>
+        <w:rFonts w:ascii="Wingdings" w:hAnsi="Wingdings" w:hint="default"/>
+        <w:sz w:val="20"/>
+      </w:rPr>
+    </w:lvl>
+    <w:lvl w:ilvl="5" w:tentative="1">
+      <w:start w:val="1"/>
+      <w:numFmt w:val="bullet"/>
+      <w:lvlText w:val=""/>
+      <w:lvlJc w:val="left"/>
+      <w:pPr>
+        <w:tabs>
+          <w:tab w:val="num" w:pos="4320"/>
+        </w:tabs>
+        <w:ind w:left="4320" w:hanging="360"/>
+      </w:pPr>
+      <w:rPr>
+        <w:rFonts w:ascii="Wingdings" w:hAnsi="Wingdings" w:hint="default"/>
+        <w:sz w:val="20"/>
+      </w:rPr>
+    </w:lvl>
+    <w:lvl w:ilvl="6" w:tentative="1">
+      <w:start w:val="1"/>
+      <w:numFmt w:val="bullet"/>
+      <w:lvlText w:val=""/>
+      <w:lvlJc w:val="left"/>
+      <w:pPr>
+        <w:tabs>
+          <w:tab w:val="num" w:pos="5040"/>
+        </w:tabs>
+        <w:ind w:left="5040" w:hanging="360"/>
+      </w:pPr>
+      <w:rPr>
+        <w:rFonts w:ascii="Wingdings" w:hAnsi="Wingdings" w:hint="default"/>
+        <w:sz w:val="20"/>
+      </w:rPr>
+    </w:lvl>
+    <w:lvl w:ilvl="7" w:tentative="1">
+      <w:start w:val="1"/>
+      <w:numFmt w:val="bullet"/>
+      <w:lvlText w:val=""/>
+      <w:lvlJc w:val="left"/>
+      <w:pPr>
+        <w:tabs>
+          <w:tab w:val="num" w:pos="5760"/>
+        </w:tabs>
+        <w:ind w:left="5760" w:hanging="360"/>
+      </w:pPr>
+      <w:rPr>
+        <w:rFonts w:ascii="Wingdings" w:hAnsi="Wingdings" w:hint="default"/>
+        <w:sz w:val="20"/>
+      </w:rPr>
+    </w:lvl>
+    <w:lvl w:ilvl="8" w:tentative="1">
+      <w:start w:val="1"/>
+      <w:numFmt w:val="bullet"/>
+      <w:lvlText w:val=""/>
+      <w:lvlJc w:val="left"/>
+      <w:pPr>
+        <w:tabs>
+          <w:tab w:val="num" w:pos="6480"/>
+        </w:tabs>
+        <w:ind w:left="6480" w:hanging="360"/>
+      </w:pPr>
+      <w:rPr>
+        <w:rFonts w:ascii="Wingdings" w:hAnsi="Wingdings" w:hint="default"/>
+        <w:sz w:val="20"/>
+      </w:rPr>
+    </w:lvl>
+  </w:abstractNum>
+  <w:abstractNum w:abstractNumId="44" w15:restartNumberingAfterBreak="0">
     <w:nsid w:val="69C62058"/>
     <w:multiLevelType w:val="multilevel"/>
     <w:tmpl w:val="05944DE4"/>
@@ -9344,7 +11294,7 @@
       </w:rPr>
     </w:lvl>
   </w:abstractNum>
-  <w:abstractNum w:abstractNumId="38" w15:restartNumberingAfterBreak="0">
+  <w:abstractNum w:abstractNumId="45" w15:restartNumberingAfterBreak="0">
     <w:nsid w:val="6A93613A"/>
     <w:multiLevelType w:val="hybridMultilevel"/>
     <w:tmpl w:val="8D3824DC"/>
@@ -9457,7 +11407,7 @@
       </w:rPr>
     </w:lvl>
   </w:abstractNum>
-  <w:abstractNum w:abstractNumId="39" w15:restartNumberingAfterBreak="0">
+  <w:abstractNum w:abstractNumId="46" w15:restartNumberingAfterBreak="0">
     <w:nsid w:val="6C426D53"/>
     <w:multiLevelType w:val="multilevel"/>
     <w:tmpl w:val="B20058B2"/>
@@ -9606,7 +11556,156 @@
       </w:rPr>
     </w:lvl>
   </w:abstractNum>
-  <w:abstractNum w:abstractNumId="40" w15:restartNumberingAfterBreak="0">
+  <w:abstractNum w:abstractNumId="47" w15:restartNumberingAfterBreak="0">
+    <w:nsid w:val="6F5F62ED"/>
+    <w:multiLevelType w:val="multilevel"/>
+    <w:tmpl w:val="E32463B8"/>
+    <w:lvl w:ilvl="0">
+      <w:start w:val="1"/>
+      <w:numFmt w:val="bullet"/>
+      <w:lvlText w:val=""/>
+      <w:lvlJc w:val="left"/>
+      <w:pPr>
+        <w:tabs>
+          <w:tab w:val="num" w:pos="720"/>
+        </w:tabs>
+        <w:ind w:left="720" w:hanging="360"/>
+      </w:pPr>
+      <w:rPr>
+        <w:rFonts w:ascii="Symbol" w:hAnsi="Symbol" w:hint="default"/>
+        <w:sz w:val="20"/>
+      </w:rPr>
+    </w:lvl>
+    <w:lvl w:ilvl="1" w:tentative="1">
+      <w:start w:val="1"/>
+      <w:numFmt w:val="bullet"/>
+      <w:lvlText w:val="o"/>
+      <w:lvlJc w:val="left"/>
+      <w:pPr>
+        <w:tabs>
+          <w:tab w:val="num" w:pos="1440"/>
+        </w:tabs>
+        <w:ind w:left="1440" w:hanging="360"/>
+      </w:pPr>
+      <w:rPr>
+        <w:rFonts w:ascii="Courier New" w:hAnsi="Courier New" w:hint="default"/>
+        <w:sz w:val="20"/>
+      </w:rPr>
+    </w:lvl>
+    <w:lvl w:ilvl="2" w:tentative="1">
+      <w:start w:val="1"/>
+      <w:numFmt w:val="bullet"/>
+      <w:lvlText w:val=""/>
+      <w:lvlJc w:val="left"/>
+      <w:pPr>
+        <w:tabs>
+          <w:tab w:val="num" w:pos="2160"/>
+        </w:tabs>
+        <w:ind w:left="2160" w:hanging="360"/>
+      </w:pPr>
+      <w:rPr>
+        <w:rFonts w:ascii="Wingdings" w:hAnsi="Wingdings" w:hint="default"/>
+        <w:sz w:val="20"/>
+      </w:rPr>
+    </w:lvl>
+    <w:lvl w:ilvl="3" w:tentative="1">
+      <w:start w:val="1"/>
+      <w:numFmt w:val="bullet"/>
+      <w:lvlText w:val=""/>
+      <w:lvlJc w:val="left"/>
+      <w:pPr>
+        <w:tabs>
+          <w:tab w:val="num" w:pos="2880"/>
+        </w:tabs>
+        <w:ind w:left="2880" w:hanging="360"/>
+      </w:pPr>
+      <w:rPr>
+        <w:rFonts w:ascii="Wingdings" w:hAnsi="Wingdings" w:hint="default"/>
+        <w:sz w:val="20"/>
+      </w:rPr>
+    </w:lvl>
+    <w:lvl w:ilvl="4" w:tentative="1">
+      <w:start w:val="1"/>
+      <w:numFmt w:val="bullet"/>
+      <w:lvlText w:val=""/>
+      <w:lvlJc w:val="left"/>
+      <w:pPr>
+        <w:tabs>
+          <w:tab w:val="num" w:pos="3600"/>
+        </w:tabs>
+        <w:ind w:left="3600" w:hanging="360"/>
+      </w:pPr>
+      <w:rPr>
+        <w:rFonts w:ascii="Wingdings" w:hAnsi="Wingdings" w:hint="default"/>
+        <w:sz w:val="20"/>
+      </w:rPr>
+    </w:lvl>
+    <w:lvl w:ilvl="5" w:tentative="1">
+      <w:start w:val="1"/>
+      <w:numFmt w:val="bullet"/>
+      <w:lvlText w:val=""/>
+      <w:lvlJc w:val="left"/>
+      <w:pPr>
+        <w:tabs>
+          <w:tab w:val="num" w:pos="4320"/>
+        </w:tabs>
+        <w:ind w:left="4320" w:hanging="360"/>
+      </w:pPr>
+      <w:rPr>
+        <w:rFonts w:ascii="Wingdings" w:hAnsi="Wingdings" w:hint="default"/>
+        <w:sz w:val="20"/>
+      </w:rPr>
+    </w:lvl>
+    <w:lvl w:ilvl="6" w:tentative="1">
+      <w:start w:val="1"/>
+      <w:numFmt w:val="bullet"/>
+      <w:lvlText w:val=""/>
+      <w:lvlJc w:val="left"/>
+      <w:pPr>
+        <w:tabs>
+          <w:tab w:val="num" w:pos="5040"/>
+        </w:tabs>
+        <w:ind w:left="5040" w:hanging="360"/>
+      </w:pPr>
+      <w:rPr>
+        <w:rFonts w:ascii="Wingdings" w:hAnsi="Wingdings" w:hint="default"/>
+        <w:sz w:val="20"/>
+      </w:rPr>
+    </w:lvl>
+    <w:lvl w:ilvl="7" w:tentative="1">
+      <w:start w:val="1"/>
+      <w:numFmt w:val="bullet"/>
+      <w:lvlText w:val=""/>
+      <w:lvlJc w:val="left"/>
+      <w:pPr>
+        <w:tabs>
+          <w:tab w:val="num" w:pos="5760"/>
+        </w:tabs>
+        <w:ind w:left="5760" w:hanging="360"/>
+      </w:pPr>
+      <w:rPr>
+        <w:rFonts w:ascii="Wingdings" w:hAnsi="Wingdings" w:hint="default"/>
+        <w:sz w:val="20"/>
+      </w:rPr>
+    </w:lvl>
+    <w:lvl w:ilvl="8" w:tentative="1">
+      <w:start w:val="1"/>
+      <w:numFmt w:val="bullet"/>
+      <w:lvlText w:val=""/>
+      <w:lvlJc w:val="left"/>
+      <w:pPr>
+        <w:tabs>
+          <w:tab w:val="num" w:pos="6480"/>
+        </w:tabs>
+        <w:ind w:left="6480" w:hanging="360"/>
+      </w:pPr>
+      <w:rPr>
+        <w:rFonts w:ascii="Wingdings" w:hAnsi="Wingdings" w:hint="default"/>
+        <w:sz w:val="20"/>
+      </w:rPr>
+    </w:lvl>
+  </w:abstractNum>
+  <w:abstractNum w:abstractNumId="48" w15:restartNumberingAfterBreak="0">
     <w:nsid w:val="72A86078"/>
     <w:multiLevelType w:val="multilevel"/>
     <w:tmpl w:val="6C44EAAE"/>
@@ -9755,7 +11854,7 @@
       </w:rPr>
     </w:lvl>
   </w:abstractNum>
-  <w:abstractNum w:abstractNumId="41" w15:restartNumberingAfterBreak="0">
+  <w:abstractNum w:abstractNumId="49" w15:restartNumberingAfterBreak="0">
     <w:nsid w:val="750925AF"/>
     <w:multiLevelType w:val="multilevel"/>
     <w:tmpl w:val="B3F8E5B2"/>
@@ -9904,7 +12003,305 @@
       </w:rPr>
     </w:lvl>
   </w:abstractNum>
-  <w:abstractNum w:abstractNumId="42" w15:restartNumberingAfterBreak="0">
+  <w:abstractNum w:abstractNumId="50" w15:restartNumberingAfterBreak="0">
+    <w:nsid w:val="7A641826"/>
+    <w:multiLevelType w:val="multilevel"/>
+    <w:tmpl w:val="2BA81F76"/>
+    <w:lvl w:ilvl="0">
+      <w:start w:val="1"/>
+      <w:numFmt w:val="bullet"/>
+      <w:lvlText w:val=""/>
+      <w:lvlJc w:val="left"/>
+      <w:pPr>
+        <w:tabs>
+          <w:tab w:val="num" w:pos="720"/>
+        </w:tabs>
+        <w:ind w:left="720" w:hanging="360"/>
+      </w:pPr>
+      <w:rPr>
+        <w:rFonts w:ascii="Symbol" w:hAnsi="Symbol" w:hint="default"/>
+        <w:sz w:val="20"/>
+      </w:rPr>
+    </w:lvl>
+    <w:lvl w:ilvl="1" w:tentative="1">
+      <w:start w:val="1"/>
+      <w:numFmt w:val="bullet"/>
+      <w:lvlText w:val="o"/>
+      <w:lvlJc w:val="left"/>
+      <w:pPr>
+        <w:tabs>
+          <w:tab w:val="num" w:pos="1440"/>
+        </w:tabs>
+        <w:ind w:left="1440" w:hanging="360"/>
+      </w:pPr>
+      <w:rPr>
+        <w:rFonts w:ascii="Courier New" w:hAnsi="Courier New" w:hint="default"/>
+        <w:sz w:val="20"/>
+      </w:rPr>
+    </w:lvl>
+    <w:lvl w:ilvl="2" w:tentative="1">
+      <w:start w:val="1"/>
+      <w:numFmt w:val="bullet"/>
+      <w:lvlText w:val=""/>
+      <w:lvlJc w:val="left"/>
+      <w:pPr>
+        <w:tabs>
+          <w:tab w:val="num" w:pos="2160"/>
+        </w:tabs>
+        <w:ind w:left="2160" w:hanging="360"/>
+      </w:pPr>
+      <w:rPr>
+        <w:rFonts w:ascii="Wingdings" w:hAnsi="Wingdings" w:hint="default"/>
+        <w:sz w:val="20"/>
+      </w:rPr>
+    </w:lvl>
+    <w:lvl w:ilvl="3" w:tentative="1">
+      <w:start w:val="1"/>
+      <w:numFmt w:val="bullet"/>
+      <w:lvlText w:val=""/>
+      <w:lvlJc w:val="left"/>
+      <w:pPr>
+        <w:tabs>
+          <w:tab w:val="num" w:pos="2880"/>
+        </w:tabs>
+        <w:ind w:left="2880" w:hanging="360"/>
+      </w:pPr>
+      <w:rPr>
+        <w:rFonts w:ascii="Wingdings" w:hAnsi="Wingdings" w:hint="default"/>
+        <w:sz w:val="20"/>
+      </w:rPr>
+    </w:lvl>
+    <w:lvl w:ilvl="4" w:tentative="1">
+      <w:start w:val="1"/>
+      <w:numFmt w:val="bullet"/>
+      <w:lvlText w:val=""/>
+      <w:lvlJc w:val="left"/>
+      <w:pPr>
+        <w:tabs>
+          <w:tab w:val="num" w:pos="3600"/>
+        </w:tabs>
+        <w:ind w:left="3600" w:hanging="360"/>
+      </w:pPr>
+      <w:rPr>
+        <w:rFonts w:ascii="Wingdings" w:hAnsi="Wingdings" w:hint="default"/>
+        <w:sz w:val="20"/>
+      </w:rPr>
+    </w:lvl>
+    <w:lvl w:ilvl="5" w:tentative="1">
+      <w:start w:val="1"/>
+      <w:numFmt w:val="bullet"/>
+      <w:lvlText w:val=""/>
+      <w:lvlJc w:val="left"/>
+      <w:pPr>
+        <w:tabs>
+          <w:tab w:val="num" w:pos="4320"/>
+        </w:tabs>
+        <w:ind w:left="4320" w:hanging="360"/>
+      </w:pPr>
+      <w:rPr>
+        <w:rFonts w:ascii="Wingdings" w:hAnsi="Wingdings" w:hint="default"/>
+        <w:sz w:val="20"/>
+      </w:rPr>
+    </w:lvl>
+    <w:lvl w:ilvl="6" w:tentative="1">
+      <w:start w:val="1"/>
+      <w:numFmt w:val="bullet"/>
+      <w:lvlText w:val=""/>
+      <w:lvlJc w:val="left"/>
+      <w:pPr>
+        <w:tabs>
+          <w:tab w:val="num" w:pos="5040"/>
+        </w:tabs>
+        <w:ind w:left="5040" w:hanging="360"/>
+      </w:pPr>
+      <w:rPr>
+        <w:rFonts w:ascii="Wingdings" w:hAnsi="Wingdings" w:hint="default"/>
+        <w:sz w:val="20"/>
+      </w:rPr>
+    </w:lvl>
+    <w:lvl w:ilvl="7" w:tentative="1">
+      <w:start w:val="1"/>
+      <w:numFmt w:val="bullet"/>
+      <w:lvlText w:val=""/>
+      <w:lvlJc w:val="left"/>
+      <w:pPr>
+        <w:tabs>
+          <w:tab w:val="num" w:pos="5760"/>
+        </w:tabs>
+        <w:ind w:left="5760" w:hanging="360"/>
+      </w:pPr>
+      <w:rPr>
+        <w:rFonts w:ascii="Wingdings" w:hAnsi="Wingdings" w:hint="default"/>
+        <w:sz w:val="20"/>
+      </w:rPr>
+    </w:lvl>
+    <w:lvl w:ilvl="8" w:tentative="1">
+      <w:start w:val="1"/>
+      <w:numFmt w:val="bullet"/>
+      <w:lvlText w:val=""/>
+      <w:lvlJc w:val="left"/>
+      <w:pPr>
+        <w:tabs>
+          <w:tab w:val="num" w:pos="6480"/>
+        </w:tabs>
+        <w:ind w:left="6480" w:hanging="360"/>
+      </w:pPr>
+      <w:rPr>
+        <w:rFonts w:ascii="Wingdings" w:hAnsi="Wingdings" w:hint="default"/>
+        <w:sz w:val="20"/>
+      </w:rPr>
+    </w:lvl>
+  </w:abstractNum>
+  <w:abstractNum w:abstractNumId="51" w15:restartNumberingAfterBreak="0">
+    <w:nsid w:val="7A8F063C"/>
+    <w:multiLevelType w:val="multilevel"/>
+    <w:tmpl w:val="9702A7A2"/>
+    <w:lvl w:ilvl="0">
+      <w:start w:val="1"/>
+      <w:numFmt w:val="bullet"/>
+      <w:lvlText w:val=""/>
+      <w:lvlJc w:val="left"/>
+      <w:pPr>
+        <w:tabs>
+          <w:tab w:val="num" w:pos="720"/>
+        </w:tabs>
+        <w:ind w:left="720" w:hanging="360"/>
+      </w:pPr>
+      <w:rPr>
+        <w:rFonts w:ascii="Symbol" w:hAnsi="Symbol" w:hint="default"/>
+        <w:sz w:val="20"/>
+      </w:rPr>
+    </w:lvl>
+    <w:lvl w:ilvl="1" w:tentative="1">
+      <w:start w:val="1"/>
+      <w:numFmt w:val="bullet"/>
+      <w:lvlText w:val="o"/>
+      <w:lvlJc w:val="left"/>
+      <w:pPr>
+        <w:tabs>
+          <w:tab w:val="num" w:pos="1440"/>
+        </w:tabs>
+        <w:ind w:left="1440" w:hanging="360"/>
+      </w:pPr>
+      <w:rPr>
+        <w:rFonts w:ascii="Courier New" w:hAnsi="Courier New" w:hint="default"/>
+        <w:sz w:val="20"/>
+      </w:rPr>
+    </w:lvl>
+    <w:lvl w:ilvl="2" w:tentative="1">
+      <w:start w:val="1"/>
+      <w:numFmt w:val="bullet"/>
+      <w:lvlText w:val=""/>
+      <w:lvlJc w:val="left"/>
+      <w:pPr>
+        <w:tabs>
+          <w:tab w:val="num" w:pos="2160"/>
+        </w:tabs>
+        <w:ind w:left="2160" w:hanging="360"/>
+      </w:pPr>
+      <w:rPr>
+        <w:rFonts w:ascii="Wingdings" w:hAnsi="Wingdings" w:hint="default"/>
+        <w:sz w:val="20"/>
+      </w:rPr>
+    </w:lvl>
+    <w:lvl w:ilvl="3" w:tentative="1">
+      <w:start w:val="1"/>
+      <w:numFmt w:val="bullet"/>
+      <w:lvlText w:val=""/>
+      <w:lvlJc w:val="left"/>
+      <w:pPr>
+        <w:tabs>
+          <w:tab w:val="num" w:pos="2880"/>
+        </w:tabs>
+        <w:ind w:left="2880" w:hanging="360"/>
+      </w:pPr>
+      <w:rPr>
+        <w:rFonts w:ascii="Wingdings" w:hAnsi="Wingdings" w:hint="default"/>
+        <w:sz w:val="20"/>
+      </w:rPr>
+    </w:lvl>
+    <w:lvl w:ilvl="4" w:tentative="1">
+      <w:start w:val="1"/>
+      <w:numFmt w:val="bullet"/>
+      <w:lvlText w:val=""/>
+      <w:lvlJc w:val="left"/>
+      <w:pPr>
+        <w:tabs>
+          <w:tab w:val="num" w:pos="3600"/>
+        </w:tabs>
+        <w:ind w:left="3600" w:hanging="360"/>
+      </w:pPr>
+      <w:rPr>
+        <w:rFonts w:ascii="Wingdings" w:hAnsi="Wingdings" w:hint="default"/>
+        <w:sz w:val="20"/>
+      </w:rPr>
+    </w:lvl>
+    <w:lvl w:ilvl="5" w:tentative="1">
+      <w:start w:val="1"/>
+      <w:numFmt w:val="bullet"/>
+      <w:lvlText w:val=""/>
+      <w:lvlJc w:val="left"/>
+      <w:pPr>
+        <w:tabs>
+          <w:tab w:val="num" w:pos="4320"/>
+        </w:tabs>
+        <w:ind w:left="4320" w:hanging="360"/>
+      </w:pPr>
+      <w:rPr>
+        <w:rFonts w:ascii="Wingdings" w:hAnsi="Wingdings" w:hint="default"/>
+        <w:sz w:val="20"/>
+      </w:rPr>
+    </w:lvl>
+    <w:lvl w:ilvl="6" w:tentative="1">
+      <w:start w:val="1"/>
+      <w:numFmt w:val="bullet"/>
+      <w:lvlText w:val=""/>
+      <w:lvlJc w:val="left"/>
+      <w:pPr>
+        <w:tabs>
+          <w:tab w:val="num" w:pos="5040"/>
+        </w:tabs>
+        <w:ind w:left="5040" w:hanging="360"/>
+      </w:pPr>
+      <w:rPr>
+        <w:rFonts w:ascii="Wingdings" w:hAnsi="Wingdings" w:hint="default"/>
+        <w:sz w:val="20"/>
+      </w:rPr>
+    </w:lvl>
+    <w:lvl w:ilvl="7" w:tentative="1">
+      <w:start w:val="1"/>
+      <w:numFmt w:val="bullet"/>
+      <w:lvlText w:val=""/>
+      <w:lvlJc w:val="left"/>
+      <w:pPr>
+        <w:tabs>
+          <w:tab w:val="num" w:pos="5760"/>
+        </w:tabs>
+        <w:ind w:left="5760" w:hanging="360"/>
+      </w:pPr>
+      <w:rPr>
+        <w:rFonts w:ascii="Wingdings" w:hAnsi="Wingdings" w:hint="default"/>
+        <w:sz w:val="20"/>
+      </w:rPr>
+    </w:lvl>
+    <w:lvl w:ilvl="8" w:tentative="1">
+      <w:start w:val="1"/>
+      <w:numFmt w:val="bullet"/>
+      <w:lvlText w:val=""/>
+      <w:lvlJc w:val="left"/>
+      <w:pPr>
+        <w:tabs>
+          <w:tab w:val="num" w:pos="6480"/>
+        </w:tabs>
+        <w:ind w:left="6480" w:hanging="360"/>
+      </w:pPr>
+      <w:rPr>
+        <w:rFonts w:ascii="Wingdings" w:hAnsi="Wingdings" w:hint="default"/>
+        <w:sz w:val="20"/>
+      </w:rPr>
+    </w:lvl>
+  </w:abstractNum>
+  <w:abstractNum w:abstractNumId="52" w15:restartNumberingAfterBreak="0">
     <w:nsid w:val="7E57355F"/>
     <w:multiLevelType w:val="multilevel"/>
     <w:tmpl w:val="8A066E46"/>
@@ -10053,7 +12450,7 @@
       </w:rPr>
     </w:lvl>
   </w:abstractNum>
-  <w:abstractNum w:abstractNumId="43" w15:restartNumberingAfterBreak="0">
+  <w:abstractNum w:abstractNumId="53" w15:restartNumberingAfterBreak="0">
     <w:nsid w:val="7FDE4284"/>
     <w:multiLevelType w:val="multilevel"/>
     <w:tmpl w:val="0558509C"/>
@@ -10203,136 +12600,166 @@
     </w:lvl>
   </w:abstractNum>
   <w:num w:numId="1" w16cid:durableId="1555968393">
+    <w:abstractNumId w:val="4"/>
+  </w:num>
+  <w:num w:numId="2" w16cid:durableId="1765416882">
+    <w:abstractNumId w:val="42"/>
+  </w:num>
+  <w:num w:numId="3" w16cid:durableId="740104085">
+    <w:abstractNumId w:val="19"/>
+  </w:num>
+  <w:num w:numId="4" w16cid:durableId="451097304">
+    <w:abstractNumId w:val="33"/>
+  </w:num>
+  <w:num w:numId="5" w16cid:durableId="1985545700">
+    <w:abstractNumId w:val="25"/>
+  </w:num>
+  <w:num w:numId="6" w16cid:durableId="625815824">
+    <w:abstractNumId w:val="24"/>
+  </w:num>
+  <w:num w:numId="7" w16cid:durableId="1375344866">
+    <w:abstractNumId w:val="49"/>
+  </w:num>
+  <w:num w:numId="8" w16cid:durableId="334306997">
+    <w:abstractNumId w:val="23"/>
+  </w:num>
+  <w:num w:numId="9" w16cid:durableId="753628635">
+    <w:abstractNumId w:val="17"/>
+  </w:num>
+  <w:num w:numId="10" w16cid:durableId="128519587">
+    <w:abstractNumId w:val="45"/>
+  </w:num>
+  <w:num w:numId="11" w16cid:durableId="592399160">
+    <w:abstractNumId w:val="15"/>
+  </w:num>
+  <w:num w:numId="12" w16cid:durableId="1232740517">
+    <w:abstractNumId w:val="44"/>
+  </w:num>
+  <w:num w:numId="13" w16cid:durableId="1408965740">
+    <w:abstractNumId w:val="10"/>
+  </w:num>
+  <w:num w:numId="14" w16cid:durableId="1311445826">
+    <w:abstractNumId w:val="14"/>
+  </w:num>
+  <w:num w:numId="15" w16cid:durableId="955018225">
+    <w:abstractNumId w:val="9"/>
+  </w:num>
+  <w:num w:numId="16" w16cid:durableId="1867908463">
+    <w:abstractNumId w:val="38"/>
+  </w:num>
+  <w:num w:numId="17" w16cid:durableId="2103262376">
+    <w:abstractNumId w:val="27"/>
+  </w:num>
+  <w:num w:numId="18" w16cid:durableId="12078482">
     <w:abstractNumId w:val="3"/>
   </w:num>
-  <w:num w:numId="2" w16cid:durableId="1765416882">
-    <w:abstractNumId w:val="36"/>
+  <w:num w:numId="19" w16cid:durableId="1564411971">
+    <w:abstractNumId w:val="40"/>
   </w:num>
-  <w:num w:numId="3" w16cid:durableId="740104085">
-    <w:abstractNumId w:val="15"/>
+  <w:num w:numId="20" w16cid:durableId="1891571225">
+    <w:abstractNumId w:val="53"/>
   </w:num>
-  <w:num w:numId="4" w16cid:durableId="451097304">
-    <w:abstractNumId w:val="27"/>
+  <w:num w:numId="21" w16cid:durableId="2064982046">
+    <w:abstractNumId w:val="30"/>
   </w:num>
-  <w:num w:numId="5" w16cid:durableId="1985545700">
-    <w:abstractNumId w:val="21"/>
+  <w:num w:numId="22" w16cid:durableId="1428386581">
+    <w:abstractNumId w:val="11"/>
   </w:num>
-  <w:num w:numId="6" w16cid:durableId="625815824">
+  <w:num w:numId="23" w16cid:durableId="319770221">
+    <w:abstractNumId w:val="13"/>
+  </w:num>
+  <w:num w:numId="24" w16cid:durableId="152768321">
+    <w:abstractNumId w:val="31"/>
+  </w:num>
+  <w:num w:numId="25" w16cid:durableId="1593276885">
     <w:abstractNumId w:val="20"/>
   </w:num>
-  <w:num w:numId="7" w16cid:durableId="1375344866">
-    <w:abstractNumId w:val="41"/>
-  </w:num>
-  <w:num w:numId="8" w16cid:durableId="334306997">
-    <w:abstractNumId w:val="19"/>
-  </w:num>
-  <w:num w:numId="9" w16cid:durableId="753628635">
-    <w:abstractNumId w:val="13"/>
-  </w:num>
-  <w:num w:numId="10" w16cid:durableId="128519587">
-    <w:abstractNumId w:val="38"/>
-  </w:num>
-  <w:num w:numId="11" w16cid:durableId="592399160">
-    <w:abstractNumId w:val="12"/>
-  </w:num>
-  <w:num w:numId="12" w16cid:durableId="1232740517">
-    <w:abstractNumId w:val="37"/>
-  </w:num>
-  <w:num w:numId="13" w16cid:durableId="1408965740">
-    <w:abstractNumId w:val="8"/>
-  </w:num>
-  <w:num w:numId="14" w16cid:durableId="1311445826">
-    <w:abstractNumId w:val="11"/>
-  </w:num>
-  <w:num w:numId="15" w16cid:durableId="955018225">
-    <w:abstractNumId w:val="7"/>
-  </w:num>
-  <w:num w:numId="16" w16cid:durableId="1867908463">
-    <w:abstractNumId w:val="32"/>
-  </w:num>
-  <w:num w:numId="17" w16cid:durableId="2103262376">
-    <w:abstractNumId w:val="23"/>
-  </w:num>
-  <w:num w:numId="18" w16cid:durableId="12078482">
-    <w:abstractNumId w:val="2"/>
-  </w:num>
-  <w:num w:numId="19" w16cid:durableId="1564411971">
-    <w:abstractNumId w:val="34"/>
-  </w:num>
-  <w:num w:numId="20" w16cid:durableId="1891571225">
-    <w:abstractNumId w:val="43"/>
-  </w:num>
-  <w:num w:numId="21" w16cid:durableId="2064982046">
-    <w:abstractNumId w:val="25"/>
-  </w:num>
-  <w:num w:numId="22" w16cid:durableId="1428386581">
-    <w:abstractNumId w:val="9"/>
-  </w:num>
-  <w:num w:numId="23" w16cid:durableId="319770221">
-    <w:abstractNumId w:val="10"/>
-  </w:num>
-  <w:num w:numId="24" w16cid:durableId="152768321">
-    <w:abstractNumId w:val="26"/>
-  </w:num>
-  <w:num w:numId="25" w16cid:durableId="1593276885">
-    <w:abstractNumId w:val="16"/>
-  </w:num>
   <w:num w:numId="26" w16cid:durableId="1399132279">
-    <w:abstractNumId w:val="24"/>
+    <w:abstractNumId w:val="28"/>
   </w:num>
   <w:num w:numId="27" w16cid:durableId="852842464">
     <w:abstractNumId w:val="0"/>
   </w:num>
   <w:num w:numId="28" w16cid:durableId="1850635193">
-    <w:abstractNumId w:val="40"/>
+    <w:abstractNumId w:val="48"/>
   </w:num>
   <w:num w:numId="29" w16cid:durableId="348722566">
-    <w:abstractNumId w:val="14"/>
+    <w:abstractNumId w:val="18"/>
   </w:num>
   <w:num w:numId="30" w16cid:durableId="1098790833">
-    <w:abstractNumId w:val="33"/>
+    <w:abstractNumId w:val="39"/>
   </w:num>
   <w:num w:numId="31" w16cid:durableId="1841577748">
-    <w:abstractNumId w:val="28"/>
+    <w:abstractNumId w:val="34"/>
   </w:num>
   <w:num w:numId="32" w16cid:durableId="828981921">
-    <w:abstractNumId w:val="17"/>
+    <w:abstractNumId w:val="21"/>
   </w:num>
   <w:num w:numId="33" w16cid:durableId="1861314800">
-    <w:abstractNumId w:val="42"/>
+    <w:abstractNumId w:val="52"/>
   </w:num>
   <w:num w:numId="34" w16cid:durableId="168760396">
+    <w:abstractNumId w:val="7"/>
+  </w:num>
+  <w:num w:numId="35" w16cid:durableId="1046834658">
+    <w:abstractNumId w:val="35"/>
+  </w:num>
+  <w:num w:numId="36" w16cid:durableId="1979720576">
+    <w:abstractNumId w:val="26"/>
+  </w:num>
+  <w:num w:numId="37" w16cid:durableId="1775243162">
+    <w:abstractNumId w:val="8"/>
+  </w:num>
+  <w:num w:numId="38" w16cid:durableId="1727098437">
+    <w:abstractNumId w:val="6"/>
+  </w:num>
+  <w:num w:numId="39" w16cid:durableId="1957904883">
+    <w:abstractNumId w:val="36"/>
+  </w:num>
+  <w:num w:numId="40" w16cid:durableId="1507131548">
+    <w:abstractNumId w:val="2"/>
+  </w:num>
+  <w:num w:numId="41" w16cid:durableId="1365327968">
+    <w:abstractNumId w:val="41"/>
+  </w:num>
+  <w:num w:numId="42" w16cid:durableId="1119491854">
+    <w:abstractNumId w:val="37"/>
+  </w:num>
+  <w:num w:numId="43" w16cid:durableId="394010231">
+    <w:abstractNumId w:val="46"/>
+  </w:num>
+  <w:num w:numId="44" w16cid:durableId="478769728">
+    <w:abstractNumId w:val="22"/>
+  </w:num>
+  <w:num w:numId="45" w16cid:durableId="1342971896">
+    <w:abstractNumId w:val="51"/>
+  </w:num>
+  <w:num w:numId="46" w16cid:durableId="1728412701">
+    <w:abstractNumId w:val="16"/>
+  </w:num>
+  <w:num w:numId="47" w16cid:durableId="740104076">
     <w:abstractNumId w:val="5"/>
   </w:num>
-  <w:num w:numId="35" w16cid:durableId="1046834658">
+  <w:num w:numId="48" w16cid:durableId="107629071">
+    <w:abstractNumId w:val="47"/>
+  </w:num>
+  <w:num w:numId="49" w16cid:durableId="2073187319">
+    <w:abstractNumId w:val="1"/>
+  </w:num>
+  <w:num w:numId="50" w16cid:durableId="1565990395">
+    <w:abstractNumId w:val="43"/>
+  </w:num>
+  <w:num w:numId="51" w16cid:durableId="1902667029">
+    <w:abstractNumId w:val="32"/>
+  </w:num>
+  <w:num w:numId="52" w16cid:durableId="657614862">
     <w:abstractNumId w:val="29"/>
   </w:num>
-  <w:num w:numId="36" w16cid:durableId="1979720576">
-    <w:abstractNumId w:val="22"/>
+  <w:num w:numId="53" w16cid:durableId="659237117">
+    <w:abstractNumId w:val="50"/>
   </w:num>
-  <w:num w:numId="37" w16cid:durableId="1775243162">
-    <w:abstractNumId w:val="6"/>
-  </w:num>
-  <w:num w:numId="38" w16cid:durableId="1727098437">
-    <w:abstractNumId w:val="4"/>
-  </w:num>
-  <w:num w:numId="39" w16cid:durableId="1957904883">
-    <w:abstractNumId w:val="30"/>
-  </w:num>
-  <w:num w:numId="40" w16cid:durableId="1507131548">
-    <w:abstractNumId w:val="1"/>
-  </w:num>
-  <w:num w:numId="41" w16cid:durableId="1365327968">
-    <w:abstractNumId w:val="35"/>
-  </w:num>
-  <w:num w:numId="42" w16cid:durableId="1119491854">
-    <w:abstractNumId w:val="31"/>
-  </w:num>
-  <w:num w:numId="43" w16cid:durableId="394010231">
-    <w:abstractNumId w:val="39"/>
-  </w:num>
-  <w:num w:numId="44" w16cid:durableId="478769728">
-    <w:abstractNumId w:val="18"/>
+  <w:num w:numId="54" w16cid:durableId="1136753826">
+    <w:abstractNumId w:val="12"/>
   </w:num>
 </w:numbering>
 </file>
@@ -11710,7 +14137,7 @@
 </file>
 
 <file path=customXml/itemProps1.xml><?xml version="1.0" encoding="utf-8"?>
-<ds:datastoreItem xmlns:ds="http://schemas.openxmlformats.org/officeDocument/2006/customXml" ds:itemID="{5D747999-7EE8-E546-A005-D54B2E6170C6}">
+<ds:datastoreItem xmlns:ds="http://schemas.openxmlformats.org/officeDocument/2006/customXml" ds:itemID="{3E0D5FEA-E5A8-5349-856A-69567C404C30}">
   <ds:schemaRefs>
     <ds:schemaRef ds:uri="http://schemas.openxmlformats.org/officeDocument/2006/bibliography"/>
   </ds:schemaRefs>

</xml_diff>